<commit_message>
docs: embed all 12 architectural & benchmark diagrams; update guide to Mr. Dhananjay Kumar Prasad and enrollment to 233CSF010
</commit_message>
<xml_diff>
--- a/AegisPath_Enterprise_Major_Project_Final_Report.docx
+++ b/AegisPath_Enterprise_Major_Project_Final_Report.docx
@@ -49,7 +49,7 @@
     </w:p>
     <w:p>
       <w:pPr>
-        <w:spacing w:before="0" w:after="480" w:line="360" w:lineRule="auto"/>
+        <w:spacing w:before="0" w:after="440" w:line="360" w:lineRule="auto"/>
         <w:jc w:val="center"/>
       </w:pPr>
       <w:r>
@@ -57,7 +57,7 @@
           <w:rFonts w:ascii="Times New Roman" w:hAnsi="Times New Roman"/>
           <w:b/>
           <w:i w:val="0"/>
-          <w:sz w:val="32"/>
+          <w:sz w:val="30"/>
         </w:rPr>
         <w:t>AEGISPATH ENTERPRISE: AN ADAPTIVE ATTACK PATH MANAGEMENT &amp; MULTI-CLOUD CYBER THREAT INTELLIGENCE ENGINE</w:t>
       </w:r>
@@ -139,7 +139,7 @@
     </w:p>
     <w:p>
       <w:pPr>
-        <w:spacing w:before="0" w:after="640" w:line="360" w:lineRule="auto"/>
+        <w:spacing w:before="0" w:after="560" w:line="360" w:lineRule="auto"/>
         <w:jc w:val="center"/>
       </w:pPr>
       <w:r>
@@ -188,7 +188,7 @@
               </w:rPr>
               <w:t>Tanishq Jain</w:t>
               <w:br/>
-              <w:t>(Enrollment No: 233CS0188)</w:t>
+              <w:t>(Enrollment No: 233CSF010)</w:t>
             </w:r>
           </w:p>
         </w:tc>
@@ -217,9 +217,9 @@
                 <w:i w:val="0"/>
                 <w:sz w:val="24"/>
               </w:rPr>
-              <w:t>Dr. Bharat Pahadiya</w:t>
+              <w:t>Mr. Dhananjay Kumar Prasad</w:t>
               <w:br/>
-              <w:t>Professor &amp; Project Coordinator</w:t>
+              <w:t>Assistant Professor &amp; Project Guide</w:t>
             </w:r>
           </w:p>
         </w:tc>
@@ -227,7 +227,7 @@
     </w:tbl>
     <w:p>
       <w:pPr>
-        <w:spacing w:before="800" w:after="0" w:line="360" w:lineRule="auto"/>
+        <w:spacing w:before="720" w:after="0" w:line="360" w:lineRule="auto"/>
         <w:jc w:val="left"/>
       </w:pPr>
     </w:p>
@@ -338,7 +338,7 @@
           <w:i w:val="0"/>
           <w:sz w:val="24"/>
         </w:rPr>
-        <w:t>Name: Tanishq Jain (Enrollment No: 233CS0188)</w:t>
+        <w:t>Name: Tanishq Jain (Enrollment No: 233CSF010)</w:t>
       </w:r>
     </w:p>
     <w:p>
@@ -405,7 +405,7 @@
           <w:i w:val="0"/>
           <w:sz w:val="24"/>
         </w:rPr>
-        <w:t>Tanishq Jain     (Enrollment No. 233CS0188)</w:t>
+        <w:t>Tanishq Jain     (Enrollment No. 233CSF010)</w:t>
       </w:r>
     </w:p>
     <w:p>
@@ -437,7 +437,7 @@
         </w:rPr>
         <w:t>Signature: ___________________________</w:t>
         <w:br/>
-        <w:t>Name: Dr. Bharat Pahadiya</w:t>
+        <w:t>Name: Mr. Dhananjay Kumar Prasad</w:t>
         <w:br/>
         <w:t>(Project Guide)</w:t>
       </w:r>
@@ -595,7 +595,7 @@
           <w:i w:val="0"/>
           <w:sz w:val="24"/>
         </w:rPr>
-        <w:t>I would like to express my profound gratitude and deep appreciation to my project guide, Dr. Bharat Pahadiya, Professor, Department of Computer Science &amp; Engineering, Oriental University, Indore, for his exemplary guidance, continuous encouragement, and invaluable technical critique throughout the development and documentation of this major project.</w:t>
+        <w:t>I would like to express my profound gratitude and deep appreciation to my project guide, Mr. Dhananjay Kumar Prasad, Assistant Professor, Department of Computer Science &amp; Engineering, Oriental University, Indore, for his exemplary guidance, continuous encouragement, and invaluable technical critique throughout the development and documentation of this major project.</w:t>
       </w:r>
     </w:p>
     <w:p>
@@ -610,7 +610,7 @@
           <w:i w:val="0"/>
           <w:sz w:val="24"/>
         </w:rPr>
-        <w:t>I am also immensely grateful to the Head of the Department and all faculty members of the Computer Science &amp; Engineering Department for providing the necessary infrastructural facilities, academic resources, and constructive feedback that enabled the successful completion of this engineering undertaking.</w:t>
+        <w:t>I am also immensely grateful to the Head of the Department and all faculty members of the Computer Science &amp; Engineering Department for providing the necessary computational infrastructure, academic resources, and constructive feedback that enabled the successful completion of this engineering undertaking.</w:t>
       </w:r>
     </w:p>
     <w:p>
@@ -642,9 +642,9 @@
         </w:rPr>
         <w:t>Tanishq Jain</w:t>
         <w:br/>
-        <w:t>Enrollment No: 233CS0188</w:t>
+        <w:t>Enrollment No: 233CSF010</w:t>
         <w:br/>
-        <w:t>B.Tech. CSE, VII Semester</w:t>
+        <w:t>B.Tech. CSE, VIII Semester</w:t>
       </w:r>
     </w:p>
     <w:p>
@@ -683,10 +683,10 @@
           <w:tcPr>
             <w:tcW w:type="dxa" w:w="4320"/>
             <w:tcMar>
-              <w:top w:w="40" w:type="dxa"/>
-              <w:bottom w:w="40" w:type="dxa"/>
-              <w:left w:w="50" w:type="dxa"/>
-              <w:right w:w="50" w:type="dxa"/>
+              <w:top w:w="30" w:type="dxa"/>
+              <w:bottom w:w="30" w:type="dxa"/>
+              <w:left w:w="40" w:type="dxa"/>
+              <w:right w:w="40" w:type="dxa"/>
             </w:tcMar>
           </w:tcPr>
           <w:p>
@@ -695,7 +695,7 @@
                 <w:rFonts w:ascii="Times New Roman" w:hAnsi="Times New Roman"/>
                 <w:b w:val="0"/>
                 <w:i w:val="0"/>
-                <w:sz w:val="21"/>
+                <w:sz w:val="20"/>
               </w:rPr>
               <w:t>Title Page</w:t>
             </w:r>
@@ -705,10 +705,10 @@
           <w:tcPr>
             <w:tcW w:type="dxa" w:w="4320"/>
             <w:tcMar>
-              <w:top w:w="40" w:type="dxa"/>
-              <w:bottom w:w="40" w:type="dxa"/>
-              <w:left w:w="50" w:type="dxa"/>
-              <w:right w:w="50" w:type="dxa"/>
+              <w:top w:w="30" w:type="dxa"/>
+              <w:bottom w:w="30" w:type="dxa"/>
+              <w:left w:w="40" w:type="dxa"/>
+              <w:right w:w="40" w:type="dxa"/>
             </w:tcMar>
           </w:tcPr>
           <w:p>
@@ -720,7 +720,7 @@
                 <w:rFonts w:ascii="Times New Roman" w:hAnsi="Times New Roman"/>
                 <w:b w:val="0"/>
                 <w:i w:val="0"/>
-                <w:sz w:val="21"/>
+                <w:sz w:val="20"/>
               </w:rPr>
               <w:t>i</w:t>
             </w:r>
@@ -732,10 +732,10 @@
           <w:tcPr>
             <w:tcW w:type="dxa" w:w="4320"/>
             <w:tcMar>
-              <w:top w:w="40" w:type="dxa"/>
-              <w:bottom w:w="40" w:type="dxa"/>
-              <w:left w:w="50" w:type="dxa"/>
-              <w:right w:w="50" w:type="dxa"/>
+              <w:top w:w="30" w:type="dxa"/>
+              <w:bottom w:w="30" w:type="dxa"/>
+              <w:left w:w="40" w:type="dxa"/>
+              <w:right w:w="40" w:type="dxa"/>
             </w:tcMar>
           </w:tcPr>
           <w:p>
@@ -744,7 +744,7 @@
                 <w:rFonts w:ascii="Times New Roman" w:hAnsi="Times New Roman"/>
                 <w:b w:val="0"/>
                 <w:i w:val="0"/>
-                <w:sz w:val="21"/>
+                <w:sz w:val="20"/>
               </w:rPr>
               <w:t>Declaration of the Student</w:t>
             </w:r>
@@ -754,10 +754,10 @@
           <w:tcPr>
             <w:tcW w:type="dxa" w:w="4320"/>
             <w:tcMar>
-              <w:top w:w="40" w:type="dxa"/>
-              <w:bottom w:w="40" w:type="dxa"/>
-              <w:left w:w="50" w:type="dxa"/>
-              <w:right w:w="50" w:type="dxa"/>
+              <w:top w:w="30" w:type="dxa"/>
+              <w:bottom w:w="30" w:type="dxa"/>
+              <w:left w:w="40" w:type="dxa"/>
+              <w:right w:w="40" w:type="dxa"/>
             </w:tcMar>
           </w:tcPr>
           <w:p>
@@ -769,7 +769,7 @@
                 <w:rFonts w:ascii="Times New Roman" w:hAnsi="Times New Roman"/>
                 <w:b w:val="0"/>
                 <w:i w:val="0"/>
-                <w:sz w:val="21"/>
+                <w:sz w:val="20"/>
               </w:rPr>
               <w:t>ii</w:t>
             </w:r>
@@ -781,10 +781,10 @@
           <w:tcPr>
             <w:tcW w:type="dxa" w:w="4320"/>
             <w:tcMar>
-              <w:top w:w="40" w:type="dxa"/>
-              <w:bottom w:w="40" w:type="dxa"/>
-              <w:left w:w="50" w:type="dxa"/>
-              <w:right w:w="50" w:type="dxa"/>
+              <w:top w:w="30" w:type="dxa"/>
+              <w:bottom w:w="30" w:type="dxa"/>
+              <w:left w:w="40" w:type="dxa"/>
+              <w:right w:w="40" w:type="dxa"/>
             </w:tcMar>
           </w:tcPr>
           <w:p>
@@ -793,7 +793,7 @@
                 <w:rFonts w:ascii="Times New Roman" w:hAnsi="Times New Roman"/>
                 <w:b w:val="0"/>
                 <w:i w:val="0"/>
-                <w:sz w:val="21"/>
+                <w:sz w:val="20"/>
               </w:rPr>
               <w:t>Certificate of the Guide &amp; Examiners</w:t>
             </w:r>
@@ -803,10 +803,10 @@
           <w:tcPr>
             <w:tcW w:type="dxa" w:w="4320"/>
             <w:tcMar>
-              <w:top w:w="40" w:type="dxa"/>
-              <w:bottom w:w="40" w:type="dxa"/>
-              <w:left w:w="50" w:type="dxa"/>
-              <w:right w:w="50" w:type="dxa"/>
+              <w:top w:w="30" w:type="dxa"/>
+              <w:bottom w:w="30" w:type="dxa"/>
+              <w:left w:w="40" w:type="dxa"/>
+              <w:right w:w="40" w:type="dxa"/>
             </w:tcMar>
           </w:tcPr>
           <w:p>
@@ -818,7 +818,7 @@
                 <w:rFonts w:ascii="Times New Roman" w:hAnsi="Times New Roman"/>
                 <w:b w:val="0"/>
                 <w:i w:val="0"/>
-                <w:sz w:val="21"/>
+                <w:sz w:val="20"/>
               </w:rPr>
               <w:t>iii</w:t>
             </w:r>
@@ -830,10 +830,10 @@
           <w:tcPr>
             <w:tcW w:type="dxa" w:w="4320"/>
             <w:tcMar>
-              <w:top w:w="40" w:type="dxa"/>
-              <w:bottom w:w="40" w:type="dxa"/>
-              <w:left w:w="50" w:type="dxa"/>
-              <w:right w:w="50" w:type="dxa"/>
+              <w:top w:w="30" w:type="dxa"/>
+              <w:bottom w:w="30" w:type="dxa"/>
+              <w:left w:w="40" w:type="dxa"/>
+              <w:right w:w="40" w:type="dxa"/>
             </w:tcMar>
           </w:tcPr>
           <w:p>
@@ -842,7 +842,7 @@
                 <w:rFonts w:ascii="Times New Roman" w:hAnsi="Times New Roman"/>
                 <w:b w:val="0"/>
                 <w:i w:val="0"/>
-                <w:sz w:val="21"/>
+                <w:sz w:val="20"/>
               </w:rPr>
               <w:t>Abstract</w:t>
             </w:r>
@@ -852,10 +852,10 @@
           <w:tcPr>
             <w:tcW w:type="dxa" w:w="4320"/>
             <w:tcMar>
-              <w:top w:w="40" w:type="dxa"/>
-              <w:bottom w:w="40" w:type="dxa"/>
-              <w:left w:w="50" w:type="dxa"/>
-              <w:right w:w="50" w:type="dxa"/>
+              <w:top w:w="30" w:type="dxa"/>
+              <w:bottom w:w="30" w:type="dxa"/>
+              <w:left w:w="40" w:type="dxa"/>
+              <w:right w:w="40" w:type="dxa"/>
             </w:tcMar>
           </w:tcPr>
           <w:p>
@@ -867,7 +867,7 @@
                 <w:rFonts w:ascii="Times New Roman" w:hAnsi="Times New Roman"/>
                 <w:b w:val="0"/>
                 <w:i w:val="0"/>
-                <w:sz w:val="21"/>
+                <w:sz w:val="20"/>
               </w:rPr>
               <w:t>iv</w:t>
             </w:r>
@@ -879,10 +879,10 @@
           <w:tcPr>
             <w:tcW w:type="dxa" w:w="4320"/>
             <w:tcMar>
-              <w:top w:w="40" w:type="dxa"/>
-              <w:bottom w:w="40" w:type="dxa"/>
-              <w:left w:w="50" w:type="dxa"/>
-              <w:right w:w="50" w:type="dxa"/>
+              <w:top w:w="30" w:type="dxa"/>
+              <w:bottom w:w="30" w:type="dxa"/>
+              <w:left w:w="40" w:type="dxa"/>
+              <w:right w:w="40" w:type="dxa"/>
             </w:tcMar>
           </w:tcPr>
           <w:p>
@@ -891,7 +891,7 @@
                 <w:rFonts w:ascii="Times New Roman" w:hAnsi="Times New Roman"/>
                 <w:b w:val="0"/>
                 <w:i w:val="0"/>
-                <w:sz w:val="21"/>
+                <w:sz w:val="20"/>
               </w:rPr>
               <w:t>Acknowledgement</w:t>
             </w:r>
@@ -901,10 +901,10 @@
           <w:tcPr>
             <w:tcW w:type="dxa" w:w="4320"/>
             <w:tcMar>
-              <w:top w:w="40" w:type="dxa"/>
-              <w:bottom w:w="40" w:type="dxa"/>
-              <w:left w:w="50" w:type="dxa"/>
-              <w:right w:w="50" w:type="dxa"/>
+              <w:top w:w="30" w:type="dxa"/>
+              <w:bottom w:w="30" w:type="dxa"/>
+              <w:left w:w="40" w:type="dxa"/>
+              <w:right w:w="40" w:type="dxa"/>
             </w:tcMar>
           </w:tcPr>
           <w:p>
@@ -916,7 +916,7 @@
                 <w:rFonts w:ascii="Times New Roman" w:hAnsi="Times New Roman"/>
                 <w:b w:val="0"/>
                 <w:i w:val="0"/>
-                <w:sz w:val="21"/>
+                <w:sz w:val="20"/>
               </w:rPr>
               <w:t>v</w:t>
             </w:r>
@@ -928,10 +928,10 @@
           <w:tcPr>
             <w:tcW w:type="dxa" w:w="4320"/>
             <w:tcMar>
-              <w:top w:w="40" w:type="dxa"/>
-              <w:bottom w:w="40" w:type="dxa"/>
-              <w:left w:w="50" w:type="dxa"/>
-              <w:right w:w="50" w:type="dxa"/>
+              <w:top w:w="30" w:type="dxa"/>
+              <w:bottom w:w="30" w:type="dxa"/>
+              <w:left w:w="40" w:type="dxa"/>
+              <w:right w:w="40" w:type="dxa"/>
             </w:tcMar>
           </w:tcPr>
           <w:p>
@@ -940,7 +940,7 @@
                 <w:rFonts w:ascii="Times New Roman" w:hAnsi="Times New Roman"/>
                 <w:b w:val="0"/>
                 <w:i w:val="0"/>
-                <w:sz w:val="21"/>
+                <w:sz w:val="20"/>
               </w:rPr>
               <w:t>List of Figures</w:t>
             </w:r>
@@ -950,10 +950,10 @@
           <w:tcPr>
             <w:tcW w:type="dxa" w:w="4320"/>
             <w:tcMar>
-              <w:top w:w="40" w:type="dxa"/>
-              <w:bottom w:w="40" w:type="dxa"/>
-              <w:left w:w="50" w:type="dxa"/>
-              <w:right w:w="50" w:type="dxa"/>
+              <w:top w:w="30" w:type="dxa"/>
+              <w:bottom w:w="30" w:type="dxa"/>
+              <w:left w:w="40" w:type="dxa"/>
+              <w:right w:w="40" w:type="dxa"/>
             </w:tcMar>
           </w:tcPr>
           <w:p>
@@ -965,7 +965,7 @@
                 <w:rFonts w:ascii="Times New Roman" w:hAnsi="Times New Roman"/>
                 <w:b w:val="0"/>
                 <w:i w:val="0"/>
-                <w:sz w:val="21"/>
+                <w:sz w:val="20"/>
               </w:rPr>
               <w:t>vi</w:t>
             </w:r>
@@ -977,10 +977,10 @@
           <w:tcPr>
             <w:tcW w:type="dxa" w:w="4320"/>
             <w:tcMar>
-              <w:top w:w="40" w:type="dxa"/>
-              <w:bottom w:w="40" w:type="dxa"/>
-              <w:left w:w="50" w:type="dxa"/>
-              <w:right w:w="50" w:type="dxa"/>
+              <w:top w:w="30" w:type="dxa"/>
+              <w:bottom w:w="30" w:type="dxa"/>
+              <w:left w:w="40" w:type="dxa"/>
+              <w:right w:w="40" w:type="dxa"/>
             </w:tcMar>
           </w:tcPr>
           <w:p>
@@ -989,7 +989,7 @@
                 <w:rFonts w:ascii="Times New Roman" w:hAnsi="Times New Roman"/>
                 <w:b w:val="0"/>
                 <w:i w:val="0"/>
-                <w:sz w:val="21"/>
+                <w:sz w:val="20"/>
               </w:rPr>
               <w:t>List of Tables</w:t>
             </w:r>
@@ -999,10 +999,10 @@
           <w:tcPr>
             <w:tcW w:type="dxa" w:w="4320"/>
             <w:tcMar>
-              <w:top w:w="40" w:type="dxa"/>
-              <w:bottom w:w="40" w:type="dxa"/>
-              <w:left w:w="50" w:type="dxa"/>
-              <w:right w:w="50" w:type="dxa"/>
+              <w:top w:w="30" w:type="dxa"/>
+              <w:bottom w:w="30" w:type="dxa"/>
+              <w:left w:w="40" w:type="dxa"/>
+              <w:right w:w="40" w:type="dxa"/>
             </w:tcMar>
           </w:tcPr>
           <w:p>
@@ -1014,7 +1014,7 @@
                 <w:rFonts w:ascii="Times New Roman" w:hAnsi="Times New Roman"/>
                 <w:b w:val="0"/>
                 <w:i w:val="0"/>
-                <w:sz w:val="21"/>
+                <w:sz w:val="20"/>
               </w:rPr>
               <w:t>vii</w:t>
             </w:r>
@@ -1026,10 +1026,10 @@
           <w:tcPr>
             <w:tcW w:type="dxa" w:w="4320"/>
             <w:tcMar>
-              <w:top w:w="40" w:type="dxa"/>
-              <w:bottom w:w="40" w:type="dxa"/>
-              <w:left w:w="50" w:type="dxa"/>
-              <w:right w:w="50" w:type="dxa"/>
+              <w:top w:w="30" w:type="dxa"/>
+              <w:bottom w:w="30" w:type="dxa"/>
+              <w:left w:w="40" w:type="dxa"/>
+              <w:right w:w="40" w:type="dxa"/>
             </w:tcMar>
           </w:tcPr>
           <w:p>
@@ -1038,7 +1038,7 @@
                 <w:rFonts w:ascii="Times New Roman" w:hAnsi="Times New Roman"/>
                 <w:b w:val="0"/>
                 <w:i w:val="0"/>
-                <w:sz w:val="21"/>
+                <w:sz w:val="20"/>
               </w:rPr>
               <w:t>Timeline / Gantt Chart</w:t>
             </w:r>
@@ -1048,10 +1048,10 @@
           <w:tcPr>
             <w:tcW w:type="dxa" w:w="4320"/>
             <w:tcMar>
-              <w:top w:w="40" w:type="dxa"/>
-              <w:bottom w:w="40" w:type="dxa"/>
-              <w:left w:w="50" w:type="dxa"/>
-              <w:right w:w="50" w:type="dxa"/>
+              <w:top w:w="30" w:type="dxa"/>
+              <w:bottom w:w="30" w:type="dxa"/>
+              <w:left w:w="40" w:type="dxa"/>
+              <w:right w:w="40" w:type="dxa"/>
             </w:tcMar>
           </w:tcPr>
           <w:p>
@@ -1063,7 +1063,7 @@
                 <w:rFonts w:ascii="Times New Roman" w:hAnsi="Times New Roman"/>
                 <w:b w:val="0"/>
                 <w:i w:val="0"/>
-                <w:sz w:val="21"/>
+                <w:sz w:val="20"/>
               </w:rPr>
               <w:t>viii</w:t>
             </w:r>
@@ -1075,10 +1075,10 @@
           <w:tcPr>
             <w:tcW w:type="dxa" w:w="4320"/>
             <w:tcMar>
-              <w:top w:w="40" w:type="dxa"/>
-              <w:bottom w:w="40" w:type="dxa"/>
-              <w:left w:w="50" w:type="dxa"/>
-              <w:right w:w="50" w:type="dxa"/>
+              <w:top w:w="30" w:type="dxa"/>
+              <w:bottom w:w="30" w:type="dxa"/>
+              <w:left w:w="40" w:type="dxa"/>
+              <w:right w:w="40" w:type="dxa"/>
             </w:tcMar>
           </w:tcPr>
           <w:p>
@@ -1087,7 +1087,7 @@
                 <w:rFonts w:ascii="Times New Roman" w:hAnsi="Times New Roman"/>
                 <w:b/>
                 <w:i w:val="0"/>
-                <w:sz w:val="21"/>
+                <w:sz w:val="20"/>
               </w:rPr>
               <w:t>1. INTRODUCTION</w:t>
             </w:r>
@@ -1097,10 +1097,10 @@
           <w:tcPr>
             <w:tcW w:type="dxa" w:w="4320"/>
             <w:tcMar>
-              <w:top w:w="40" w:type="dxa"/>
-              <w:bottom w:w="40" w:type="dxa"/>
-              <w:left w:w="50" w:type="dxa"/>
-              <w:right w:w="50" w:type="dxa"/>
+              <w:top w:w="30" w:type="dxa"/>
+              <w:bottom w:w="30" w:type="dxa"/>
+              <w:left w:w="40" w:type="dxa"/>
+              <w:right w:w="40" w:type="dxa"/>
             </w:tcMar>
           </w:tcPr>
           <w:p>
@@ -1112,7 +1112,7 @@
                 <w:rFonts w:ascii="Times New Roman" w:hAnsi="Times New Roman"/>
                 <w:b/>
                 <w:i w:val="0"/>
-                <w:sz w:val="21"/>
+                <w:sz w:val="20"/>
               </w:rPr>
               <w:t>1</w:t>
             </w:r>
@@ -1124,10 +1124,10 @@
           <w:tcPr>
             <w:tcW w:type="dxa" w:w="4320"/>
             <w:tcMar>
-              <w:top w:w="40" w:type="dxa"/>
-              <w:bottom w:w="40" w:type="dxa"/>
-              <w:left w:w="50" w:type="dxa"/>
-              <w:right w:w="50" w:type="dxa"/>
+              <w:top w:w="30" w:type="dxa"/>
+              <w:bottom w:w="30" w:type="dxa"/>
+              <w:left w:w="40" w:type="dxa"/>
+              <w:right w:w="40" w:type="dxa"/>
             </w:tcMar>
           </w:tcPr>
           <w:p>
@@ -1136,7 +1136,7 @@
                 <w:rFonts w:ascii="Times New Roman" w:hAnsi="Times New Roman"/>
                 <w:b w:val="0"/>
                 <w:i w:val="0"/>
-                <w:sz w:val="21"/>
+                <w:sz w:val="20"/>
               </w:rPr>
               <w:t xml:space="preserve">   1.1 Purpose</w:t>
             </w:r>
@@ -1146,10 +1146,10 @@
           <w:tcPr>
             <w:tcW w:type="dxa" w:w="4320"/>
             <w:tcMar>
-              <w:top w:w="40" w:type="dxa"/>
-              <w:bottom w:w="40" w:type="dxa"/>
-              <w:left w:w="50" w:type="dxa"/>
-              <w:right w:w="50" w:type="dxa"/>
+              <w:top w:w="30" w:type="dxa"/>
+              <w:bottom w:w="30" w:type="dxa"/>
+              <w:left w:w="40" w:type="dxa"/>
+              <w:right w:w="40" w:type="dxa"/>
             </w:tcMar>
           </w:tcPr>
           <w:p>
@@ -1161,7 +1161,7 @@
                 <w:rFonts w:ascii="Times New Roman" w:hAnsi="Times New Roman"/>
                 <w:b w:val="0"/>
                 <w:i w:val="0"/>
-                <w:sz w:val="21"/>
+                <w:sz w:val="20"/>
               </w:rPr>
               <w:t>1</w:t>
             </w:r>
@@ -1173,10 +1173,10 @@
           <w:tcPr>
             <w:tcW w:type="dxa" w:w="4320"/>
             <w:tcMar>
-              <w:top w:w="40" w:type="dxa"/>
-              <w:bottom w:w="40" w:type="dxa"/>
-              <w:left w:w="50" w:type="dxa"/>
-              <w:right w:w="50" w:type="dxa"/>
+              <w:top w:w="30" w:type="dxa"/>
+              <w:bottom w:w="30" w:type="dxa"/>
+              <w:left w:w="40" w:type="dxa"/>
+              <w:right w:w="40" w:type="dxa"/>
             </w:tcMar>
           </w:tcPr>
           <w:p>
@@ -1185,7 +1185,7 @@
                 <w:rFonts w:ascii="Times New Roman" w:hAnsi="Times New Roman"/>
                 <w:b w:val="0"/>
                 <w:i w:val="0"/>
-                <w:sz w:val="21"/>
+                <w:sz w:val="20"/>
               </w:rPr>
               <w:t xml:space="preserve">   1.2 Scope</w:t>
             </w:r>
@@ -1195,10 +1195,10 @@
           <w:tcPr>
             <w:tcW w:type="dxa" w:w="4320"/>
             <w:tcMar>
-              <w:top w:w="40" w:type="dxa"/>
-              <w:bottom w:w="40" w:type="dxa"/>
-              <w:left w:w="50" w:type="dxa"/>
-              <w:right w:w="50" w:type="dxa"/>
+              <w:top w:w="30" w:type="dxa"/>
+              <w:bottom w:w="30" w:type="dxa"/>
+              <w:left w:w="40" w:type="dxa"/>
+              <w:right w:w="40" w:type="dxa"/>
             </w:tcMar>
           </w:tcPr>
           <w:p>
@@ -1210,7 +1210,7 @@
                 <w:rFonts w:ascii="Times New Roman" w:hAnsi="Times New Roman"/>
                 <w:b w:val="0"/>
                 <w:i w:val="0"/>
-                <w:sz w:val="21"/>
+                <w:sz w:val="20"/>
               </w:rPr>
               <w:t>2</w:t>
             </w:r>
@@ -1222,10 +1222,10 @@
           <w:tcPr>
             <w:tcW w:type="dxa" w:w="4320"/>
             <w:tcMar>
-              <w:top w:w="40" w:type="dxa"/>
-              <w:bottom w:w="40" w:type="dxa"/>
-              <w:left w:w="50" w:type="dxa"/>
-              <w:right w:w="50" w:type="dxa"/>
+              <w:top w:w="30" w:type="dxa"/>
+              <w:bottom w:w="30" w:type="dxa"/>
+              <w:left w:w="40" w:type="dxa"/>
+              <w:right w:w="40" w:type="dxa"/>
             </w:tcMar>
           </w:tcPr>
           <w:p>
@@ -1234,7 +1234,7 @@
                 <w:rFonts w:ascii="Times New Roman" w:hAnsi="Times New Roman"/>
                 <w:b w:val="0"/>
                 <w:i w:val="0"/>
-                <w:sz w:val="21"/>
+                <w:sz w:val="20"/>
               </w:rPr>
               <w:t xml:space="preserve">   1.3 Problem in Existing System</w:t>
             </w:r>
@@ -1244,10 +1244,10 @@
           <w:tcPr>
             <w:tcW w:type="dxa" w:w="4320"/>
             <w:tcMar>
-              <w:top w:w="40" w:type="dxa"/>
-              <w:bottom w:w="40" w:type="dxa"/>
-              <w:left w:w="50" w:type="dxa"/>
-              <w:right w:w="50" w:type="dxa"/>
+              <w:top w:w="30" w:type="dxa"/>
+              <w:bottom w:w="30" w:type="dxa"/>
+              <w:left w:w="40" w:type="dxa"/>
+              <w:right w:w="40" w:type="dxa"/>
             </w:tcMar>
           </w:tcPr>
           <w:p>
@@ -1259,7 +1259,7 @@
                 <w:rFonts w:ascii="Times New Roman" w:hAnsi="Times New Roman"/>
                 <w:b w:val="0"/>
                 <w:i w:val="0"/>
-                <w:sz w:val="21"/>
+                <w:sz w:val="20"/>
               </w:rPr>
               <w:t>3</w:t>
             </w:r>
@@ -1271,10 +1271,10 @@
           <w:tcPr>
             <w:tcW w:type="dxa" w:w="4320"/>
             <w:tcMar>
-              <w:top w:w="40" w:type="dxa"/>
-              <w:bottom w:w="40" w:type="dxa"/>
-              <w:left w:w="50" w:type="dxa"/>
-              <w:right w:w="50" w:type="dxa"/>
+              <w:top w:w="30" w:type="dxa"/>
+              <w:bottom w:w="30" w:type="dxa"/>
+              <w:left w:w="40" w:type="dxa"/>
+              <w:right w:w="40" w:type="dxa"/>
             </w:tcMar>
           </w:tcPr>
           <w:p>
@@ -1283,7 +1283,7 @@
                 <w:rFonts w:ascii="Times New Roman" w:hAnsi="Times New Roman"/>
                 <w:b w:val="0"/>
                 <w:i w:val="0"/>
-                <w:sz w:val="21"/>
+                <w:sz w:val="20"/>
               </w:rPr>
               <w:t xml:space="preserve">   1.4 Statement of Problem</w:t>
             </w:r>
@@ -1293,10 +1293,10 @@
           <w:tcPr>
             <w:tcW w:type="dxa" w:w="4320"/>
             <w:tcMar>
-              <w:top w:w="40" w:type="dxa"/>
-              <w:bottom w:w="40" w:type="dxa"/>
-              <w:left w:w="50" w:type="dxa"/>
-              <w:right w:w="50" w:type="dxa"/>
+              <w:top w:w="30" w:type="dxa"/>
+              <w:bottom w:w="30" w:type="dxa"/>
+              <w:left w:w="40" w:type="dxa"/>
+              <w:right w:w="40" w:type="dxa"/>
             </w:tcMar>
           </w:tcPr>
           <w:p>
@@ -1308,7 +1308,7 @@
                 <w:rFonts w:ascii="Times New Roman" w:hAnsi="Times New Roman"/>
                 <w:b w:val="0"/>
                 <w:i w:val="0"/>
-                <w:sz w:val="21"/>
+                <w:sz w:val="20"/>
               </w:rPr>
               <w:t>4</w:t>
             </w:r>
@@ -1320,10 +1320,10 @@
           <w:tcPr>
             <w:tcW w:type="dxa" w:w="4320"/>
             <w:tcMar>
-              <w:top w:w="40" w:type="dxa"/>
-              <w:bottom w:w="40" w:type="dxa"/>
-              <w:left w:w="50" w:type="dxa"/>
-              <w:right w:w="50" w:type="dxa"/>
+              <w:top w:w="30" w:type="dxa"/>
+              <w:bottom w:w="30" w:type="dxa"/>
+              <w:left w:w="40" w:type="dxa"/>
+              <w:right w:w="40" w:type="dxa"/>
             </w:tcMar>
           </w:tcPr>
           <w:p>
@@ -1332,7 +1332,7 @@
                 <w:rFonts w:ascii="Times New Roman" w:hAnsi="Times New Roman"/>
                 <w:b/>
                 <w:i w:val="0"/>
-                <w:sz w:val="21"/>
+                <w:sz w:val="20"/>
               </w:rPr>
               <w:t>2. SYSTEM REQUIREMENT ANALYSIS</w:t>
             </w:r>
@@ -1342,10 +1342,10 @@
           <w:tcPr>
             <w:tcW w:type="dxa" w:w="4320"/>
             <w:tcMar>
-              <w:top w:w="40" w:type="dxa"/>
-              <w:bottom w:w="40" w:type="dxa"/>
-              <w:left w:w="50" w:type="dxa"/>
-              <w:right w:w="50" w:type="dxa"/>
+              <w:top w:w="30" w:type="dxa"/>
+              <w:bottom w:w="30" w:type="dxa"/>
+              <w:left w:w="40" w:type="dxa"/>
+              <w:right w:w="40" w:type="dxa"/>
             </w:tcMar>
           </w:tcPr>
           <w:p>
@@ -1357,7 +1357,7 @@
                 <w:rFonts w:ascii="Times New Roman" w:hAnsi="Times New Roman"/>
                 <w:b/>
                 <w:i w:val="0"/>
-                <w:sz w:val="21"/>
+                <w:sz w:val="20"/>
               </w:rPr>
               <w:t>5</w:t>
             </w:r>
@@ -1369,10 +1369,10 @@
           <w:tcPr>
             <w:tcW w:type="dxa" w:w="4320"/>
             <w:tcMar>
-              <w:top w:w="40" w:type="dxa"/>
-              <w:bottom w:w="40" w:type="dxa"/>
-              <w:left w:w="50" w:type="dxa"/>
-              <w:right w:w="50" w:type="dxa"/>
+              <w:top w:w="30" w:type="dxa"/>
+              <w:bottom w:w="30" w:type="dxa"/>
+              <w:left w:w="40" w:type="dxa"/>
+              <w:right w:w="40" w:type="dxa"/>
             </w:tcMar>
           </w:tcPr>
           <w:p>
@@ -1381,7 +1381,7 @@
                 <w:rFonts w:ascii="Times New Roman" w:hAnsi="Times New Roman"/>
                 <w:b w:val="0"/>
                 <w:i w:val="0"/>
-                <w:sz w:val="21"/>
+                <w:sz w:val="20"/>
               </w:rPr>
               <w:t xml:space="preserve">   2.1 Introduction (Purpose, Conventions, Audience, Scope)</w:t>
             </w:r>
@@ -1391,10 +1391,10 @@
           <w:tcPr>
             <w:tcW w:type="dxa" w:w="4320"/>
             <w:tcMar>
-              <w:top w:w="40" w:type="dxa"/>
-              <w:bottom w:w="40" w:type="dxa"/>
-              <w:left w:w="50" w:type="dxa"/>
-              <w:right w:w="50" w:type="dxa"/>
+              <w:top w:w="30" w:type="dxa"/>
+              <w:bottom w:w="30" w:type="dxa"/>
+              <w:left w:w="40" w:type="dxa"/>
+              <w:right w:w="40" w:type="dxa"/>
             </w:tcMar>
           </w:tcPr>
           <w:p>
@@ -1406,7 +1406,7 @@
                 <w:rFonts w:ascii="Times New Roman" w:hAnsi="Times New Roman"/>
                 <w:b w:val="0"/>
                 <w:i w:val="0"/>
-                <w:sz w:val="21"/>
+                <w:sz w:val="20"/>
               </w:rPr>
               <w:t>5</w:t>
             </w:r>
@@ -1418,10 +1418,10 @@
           <w:tcPr>
             <w:tcW w:type="dxa" w:w="4320"/>
             <w:tcMar>
-              <w:top w:w="40" w:type="dxa"/>
-              <w:bottom w:w="40" w:type="dxa"/>
-              <w:left w:w="50" w:type="dxa"/>
-              <w:right w:w="50" w:type="dxa"/>
+              <w:top w:w="30" w:type="dxa"/>
+              <w:bottom w:w="30" w:type="dxa"/>
+              <w:left w:w="40" w:type="dxa"/>
+              <w:right w:w="40" w:type="dxa"/>
             </w:tcMar>
           </w:tcPr>
           <w:p>
@@ -1430,7 +1430,7 @@
                 <w:rFonts w:ascii="Times New Roman" w:hAnsi="Times New Roman"/>
                 <w:b w:val="0"/>
                 <w:i w:val="0"/>
-                <w:sz w:val="21"/>
+                <w:sz w:val="20"/>
               </w:rPr>
               <w:t xml:space="preserve">   2.2 Overall Description (Product Perspective, Functions, Operating Env)</w:t>
             </w:r>
@@ -1440,10 +1440,10 @@
           <w:tcPr>
             <w:tcW w:type="dxa" w:w="4320"/>
             <w:tcMar>
-              <w:top w:w="40" w:type="dxa"/>
-              <w:bottom w:w="40" w:type="dxa"/>
-              <w:left w:w="50" w:type="dxa"/>
-              <w:right w:w="50" w:type="dxa"/>
+              <w:top w:w="30" w:type="dxa"/>
+              <w:bottom w:w="30" w:type="dxa"/>
+              <w:left w:w="40" w:type="dxa"/>
+              <w:right w:w="40" w:type="dxa"/>
             </w:tcMar>
           </w:tcPr>
           <w:p>
@@ -1455,7 +1455,7 @@
                 <w:rFonts w:ascii="Times New Roman" w:hAnsi="Times New Roman"/>
                 <w:b w:val="0"/>
                 <w:i w:val="0"/>
-                <w:sz w:val="21"/>
+                <w:sz w:val="20"/>
               </w:rPr>
               <w:t>6</w:t>
             </w:r>
@@ -1467,10 +1467,10 @@
           <w:tcPr>
             <w:tcW w:type="dxa" w:w="4320"/>
             <w:tcMar>
-              <w:top w:w="40" w:type="dxa"/>
-              <w:bottom w:w="40" w:type="dxa"/>
-              <w:left w:w="50" w:type="dxa"/>
-              <w:right w:w="50" w:type="dxa"/>
+              <w:top w:w="30" w:type="dxa"/>
+              <w:bottom w:w="30" w:type="dxa"/>
+              <w:left w:w="40" w:type="dxa"/>
+              <w:right w:w="40" w:type="dxa"/>
             </w:tcMar>
           </w:tcPr>
           <w:p>
@@ -1479,7 +1479,7 @@
                 <w:rFonts w:ascii="Times New Roman" w:hAnsi="Times New Roman"/>
                 <w:b w:val="0"/>
                 <w:i w:val="0"/>
-                <w:sz w:val="21"/>
+                <w:sz w:val="20"/>
               </w:rPr>
               <w:t xml:space="preserve">   2.3 External Interface Requirements (UI, Hardware, Software, Comm)</w:t>
             </w:r>
@@ -1489,10 +1489,10 @@
           <w:tcPr>
             <w:tcW w:type="dxa" w:w="4320"/>
             <w:tcMar>
-              <w:top w:w="40" w:type="dxa"/>
-              <w:bottom w:w="40" w:type="dxa"/>
-              <w:left w:w="50" w:type="dxa"/>
-              <w:right w:w="50" w:type="dxa"/>
+              <w:top w:w="30" w:type="dxa"/>
+              <w:bottom w:w="30" w:type="dxa"/>
+              <w:left w:w="40" w:type="dxa"/>
+              <w:right w:w="40" w:type="dxa"/>
             </w:tcMar>
           </w:tcPr>
           <w:p>
@@ -1504,7 +1504,7 @@
                 <w:rFonts w:ascii="Times New Roman" w:hAnsi="Times New Roman"/>
                 <w:b w:val="0"/>
                 <w:i w:val="0"/>
-                <w:sz w:val="21"/>
+                <w:sz w:val="20"/>
               </w:rPr>
               <w:t>8</w:t>
             </w:r>
@@ -1516,10 +1516,10 @@
           <w:tcPr>
             <w:tcW w:type="dxa" w:w="4320"/>
             <w:tcMar>
-              <w:top w:w="40" w:type="dxa"/>
-              <w:bottom w:w="40" w:type="dxa"/>
-              <w:left w:w="50" w:type="dxa"/>
-              <w:right w:w="50" w:type="dxa"/>
+              <w:top w:w="30" w:type="dxa"/>
+              <w:bottom w:w="30" w:type="dxa"/>
+              <w:left w:w="40" w:type="dxa"/>
+              <w:right w:w="40" w:type="dxa"/>
             </w:tcMar>
           </w:tcPr>
           <w:p>
@@ -1528,7 +1528,7 @@
                 <w:rFonts w:ascii="Times New Roman" w:hAnsi="Times New Roman"/>
                 <w:b w:val="0"/>
                 <w:i w:val="0"/>
-                <w:sz w:val="21"/>
+                <w:sz w:val="20"/>
               </w:rPr>
               <w:t xml:space="preserve">   2.4 Functional Requirements (System Features FR-1 to FR-8)</w:t>
             </w:r>
@@ -1538,10 +1538,10 @@
           <w:tcPr>
             <w:tcW w:type="dxa" w:w="4320"/>
             <w:tcMar>
-              <w:top w:w="40" w:type="dxa"/>
-              <w:bottom w:w="40" w:type="dxa"/>
-              <w:left w:w="50" w:type="dxa"/>
-              <w:right w:w="50" w:type="dxa"/>
+              <w:top w:w="30" w:type="dxa"/>
+              <w:bottom w:w="30" w:type="dxa"/>
+              <w:left w:w="40" w:type="dxa"/>
+              <w:right w:w="40" w:type="dxa"/>
             </w:tcMar>
           </w:tcPr>
           <w:p>
@@ -1553,7 +1553,7 @@
                 <w:rFonts w:ascii="Times New Roman" w:hAnsi="Times New Roman"/>
                 <w:b w:val="0"/>
                 <w:i w:val="0"/>
-                <w:sz w:val="21"/>
+                <w:sz w:val="20"/>
               </w:rPr>
               <w:t>9</w:t>
             </w:r>
@@ -1565,10 +1565,10 @@
           <w:tcPr>
             <w:tcW w:type="dxa" w:w="4320"/>
             <w:tcMar>
-              <w:top w:w="40" w:type="dxa"/>
-              <w:bottom w:w="40" w:type="dxa"/>
-              <w:left w:w="50" w:type="dxa"/>
-              <w:right w:w="50" w:type="dxa"/>
+              <w:top w:w="30" w:type="dxa"/>
+              <w:bottom w:w="30" w:type="dxa"/>
+              <w:left w:w="40" w:type="dxa"/>
+              <w:right w:w="40" w:type="dxa"/>
             </w:tcMar>
           </w:tcPr>
           <w:p>
@@ -1577,7 +1577,7 @@
                 <w:rFonts w:ascii="Times New Roman" w:hAnsi="Times New Roman"/>
                 <w:b w:val="0"/>
                 <w:i w:val="0"/>
-                <w:sz w:val="21"/>
+                <w:sz w:val="20"/>
               </w:rPr>
               <w:t xml:space="preserve">   2.5 Non-Functional Requirements (Performance, Security, Reliability)</w:t>
             </w:r>
@@ -1587,10 +1587,10 @@
           <w:tcPr>
             <w:tcW w:type="dxa" w:w="4320"/>
             <w:tcMar>
-              <w:top w:w="40" w:type="dxa"/>
-              <w:bottom w:w="40" w:type="dxa"/>
-              <w:left w:w="50" w:type="dxa"/>
-              <w:right w:w="50" w:type="dxa"/>
+              <w:top w:w="30" w:type="dxa"/>
+              <w:bottom w:w="30" w:type="dxa"/>
+              <w:left w:w="40" w:type="dxa"/>
+              <w:right w:w="40" w:type="dxa"/>
             </w:tcMar>
           </w:tcPr>
           <w:p>
@@ -1602,7 +1602,7 @@
                 <w:rFonts w:ascii="Times New Roman" w:hAnsi="Times New Roman"/>
                 <w:b w:val="0"/>
                 <w:i w:val="0"/>
-                <w:sz w:val="21"/>
+                <w:sz w:val="20"/>
               </w:rPr>
               <w:t>11</w:t>
             </w:r>
@@ -1614,10 +1614,10 @@
           <w:tcPr>
             <w:tcW w:type="dxa" w:w="4320"/>
             <w:tcMar>
-              <w:top w:w="40" w:type="dxa"/>
-              <w:bottom w:w="40" w:type="dxa"/>
-              <w:left w:w="50" w:type="dxa"/>
-              <w:right w:w="50" w:type="dxa"/>
+              <w:top w:w="30" w:type="dxa"/>
+              <w:bottom w:w="30" w:type="dxa"/>
+              <w:left w:w="40" w:type="dxa"/>
+              <w:right w:w="40" w:type="dxa"/>
             </w:tcMar>
           </w:tcPr>
           <w:p>
@@ -1626,7 +1626,7 @@
                 <w:rFonts w:ascii="Times New Roman" w:hAnsi="Times New Roman"/>
                 <w:b w:val="0"/>
                 <w:i w:val="0"/>
-                <w:sz w:val="21"/>
+                <w:sz w:val="20"/>
               </w:rPr>
               <w:t xml:space="preserve">   2.6 Project Plan (Team, Division of Work, Time Schedule)</w:t>
             </w:r>
@@ -1636,10 +1636,10 @@
           <w:tcPr>
             <w:tcW w:type="dxa" w:w="4320"/>
             <w:tcMar>
-              <w:top w:w="40" w:type="dxa"/>
-              <w:bottom w:w="40" w:type="dxa"/>
-              <w:left w:w="50" w:type="dxa"/>
-              <w:right w:w="50" w:type="dxa"/>
+              <w:top w:w="30" w:type="dxa"/>
+              <w:bottom w:w="30" w:type="dxa"/>
+              <w:left w:w="40" w:type="dxa"/>
+              <w:right w:w="40" w:type="dxa"/>
             </w:tcMar>
           </w:tcPr>
           <w:p>
@@ -1651,7 +1651,7 @@
                 <w:rFonts w:ascii="Times New Roman" w:hAnsi="Times New Roman"/>
                 <w:b w:val="0"/>
                 <w:i w:val="0"/>
-                <w:sz w:val="21"/>
+                <w:sz w:val="20"/>
               </w:rPr>
               <w:t>12</w:t>
             </w:r>
@@ -1663,10 +1663,10 @@
           <w:tcPr>
             <w:tcW w:type="dxa" w:w="4320"/>
             <w:tcMar>
-              <w:top w:w="40" w:type="dxa"/>
-              <w:bottom w:w="40" w:type="dxa"/>
-              <w:left w:w="50" w:type="dxa"/>
-              <w:right w:w="50" w:type="dxa"/>
+              <w:top w:w="30" w:type="dxa"/>
+              <w:bottom w:w="30" w:type="dxa"/>
+              <w:left w:w="40" w:type="dxa"/>
+              <w:right w:w="40" w:type="dxa"/>
             </w:tcMar>
           </w:tcPr>
           <w:p>
@@ -1675,7 +1675,7 @@
                 <w:rFonts w:ascii="Times New Roman" w:hAnsi="Times New Roman"/>
                 <w:b/>
                 <w:i w:val="0"/>
-                <w:sz w:val="21"/>
+                <w:sz w:val="20"/>
               </w:rPr>
               <w:t>3. SYSTEM ANALYSIS &amp; MODELING</w:t>
             </w:r>
@@ -1685,10 +1685,10 @@
           <w:tcPr>
             <w:tcW w:type="dxa" w:w="4320"/>
             <w:tcMar>
-              <w:top w:w="40" w:type="dxa"/>
-              <w:bottom w:w="40" w:type="dxa"/>
-              <w:left w:w="50" w:type="dxa"/>
-              <w:right w:w="50" w:type="dxa"/>
+              <w:top w:w="30" w:type="dxa"/>
+              <w:bottom w:w="30" w:type="dxa"/>
+              <w:left w:w="40" w:type="dxa"/>
+              <w:right w:w="40" w:type="dxa"/>
             </w:tcMar>
           </w:tcPr>
           <w:p>
@@ -1700,7 +1700,7 @@
                 <w:rFonts w:ascii="Times New Roman" w:hAnsi="Times New Roman"/>
                 <w:b/>
                 <w:i w:val="0"/>
-                <w:sz w:val="21"/>
+                <w:sz w:val="20"/>
               </w:rPr>
               <w:t>14</w:t>
             </w:r>
@@ -1712,10 +1712,10 @@
           <w:tcPr>
             <w:tcW w:type="dxa" w:w="4320"/>
             <w:tcMar>
-              <w:top w:w="40" w:type="dxa"/>
-              <w:bottom w:w="40" w:type="dxa"/>
-              <w:left w:w="50" w:type="dxa"/>
-              <w:right w:w="50" w:type="dxa"/>
+              <w:top w:w="30" w:type="dxa"/>
+              <w:bottom w:w="30" w:type="dxa"/>
+              <w:left w:w="40" w:type="dxa"/>
+              <w:right w:w="40" w:type="dxa"/>
             </w:tcMar>
           </w:tcPr>
           <w:p>
@@ -1724,7 +1724,7 @@
                 <w:rFonts w:ascii="Times New Roman" w:hAnsi="Times New Roman"/>
                 <w:b w:val="0"/>
                 <w:i w:val="0"/>
-                <w:sz w:val="21"/>
+                <w:sz w:val="20"/>
               </w:rPr>
               <w:t xml:space="preserve">   3.1 Methodology Used (Object-Oriented &amp; Graph Theory)</w:t>
             </w:r>
@@ -1734,10 +1734,10 @@
           <w:tcPr>
             <w:tcW w:type="dxa" w:w="4320"/>
             <w:tcMar>
-              <w:top w:w="40" w:type="dxa"/>
-              <w:bottom w:w="40" w:type="dxa"/>
-              <w:left w:w="50" w:type="dxa"/>
-              <w:right w:w="50" w:type="dxa"/>
+              <w:top w:w="30" w:type="dxa"/>
+              <w:bottom w:w="30" w:type="dxa"/>
+              <w:left w:w="40" w:type="dxa"/>
+              <w:right w:w="40" w:type="dxa"/>
             </w:tcMar>
           </w:tcPr>
           <w:p>
@@ -1749,7 +1749,7 @@
                 <w:rFonts w:ascii="Times New Roman" w:hAnsi="Times New Roman"/>
                 <w:b w:val="0"/>
                 <w:i w:val="0"/>
-                <w:sz w:val="21"/>
+                <w:sz w:val="20"/>
               </w:rPr>
               <w:t>14</w:t>
             </w:r>
@@ -1761,10 +1761,10 @@
           <w:tcPr>
             <w:tcW w:type="dxa" w:w="4320"/>
             <w:tcMar>
-              <w:top w:w="40" w:type="dxa"/>
-              <w:bottom w:w="40" w:type="dxa"/>
-              <w:left w:w="50" w:type="dxa"/>
-              <w:right w:w="50" w:type="dxa"/>
+              <w:top w:w="30" w:type="dxa"/>
+              <w:bottom w:w="30" w:type="dxa"/>
+              <w:left w:w="40" w:type="dxa"/>
+              <w:right w:w="40" w:type="dxa"/>
             </w:tcMar>
           </w:tcPr>
           <w:p>
@@ -1773,7 +1773,7 @@
                 <w:rFonts w:ascii="Times New Roman" w:hAnsi="Times New Roman"/>
                 <w:b w:val="0"/>
                 <w:i w:val="0"/>
-                <w:sz w:val="21"/>
+                <w:sz w:val="20"/>
               </w:rPr>
               <w:t xml:space="preserve">   3.2 Use Case Diagrams &amp; Specifications</w:t>
             </w:r>
@@ -1783,10 +1783,10 @@
           <w:tcPr>
             <w:tcW w:type="dxa" w:w="4320"/>
             <w:tcMar>
-              <w:top w:w="40" w:type="dxa"/>
-              <w:bottom w:w="40" w:type="dxa"/>
-              <w:left w:w="50" w:type="dxa"/>
-              <w:right w:w="50" w:type="dxa"/>
+              <w:top w:w="30" w:type="dxa"/>
+              <w:bottom w:w="30" w:type="dxa"/>
+              <w:left w:w="40" w:type="dxa"/>
+              <w:right w:w="40" w:type="dxa"/>
             </w:tcMar>
           </w:tcPr>
           <w:p>
@@ -1798,7 +1798,7 @@
                 <w:rFonts w:ascii="Times New Roman" w:hAnsi="Times New Roman"/>
                 <w:b w:val="0"/>
                 <w:i w:val="0"/>
-                <w:sz w:val="21"/>
+                <w:sz w:val="20"/>
               </w:rPr>
               <w:t>15</w:t>
             </w:r>
@@ -1810,10 +1810,10 @@
           <w:tcPr>
             <w:tcW w:type="dxa" w:w="4320"/>
             <w:tcMar>
-              <w:top w:w="40" w:type="dxa"/>
-              <w:bottom w:w="40" w:type="dxa"/>
-              <w:left w:w="50" w:type="dxa"/>
-              <w:right w:w="50" w:type="dxa"/>
+              <w:top w:w="30" w:type="dxa"/>
+              <w:bottom w:w="30" w:type="dxa"/>
+              <w:left w:w="40" w:type="dxa"/>
+              <w:right w:w="40" w:type="dxa"/>
             </w:tcMar>
           </w:tcPr>
           <w:p>
@@ -1822,7 +1822,7 @@
                 <w:rFonts w:ascii="Times New Roman" w:hAnsi="Times New Roman"/>
                 <w:b w:val="0"/>
                 <w:i w:val="0"/>
-                <w:sz w:val="21"/>
+                <w:sz w:val="20"/>
               </w:rPr>
               <w:t xml:space="preserve">   3.3 Sequence Diagrams (Ingestion, EDR Recalibration, Batch Sync)</w:t>
             </w:r>
@@ -1832,10 +1832,10 @@
           <w:tcPr>
             <w:tcW w:type="dxa" w:w="4320"/>
             <w:tcMar>
-              <w:top w:w="40" w:type="dxa"/>
-              <w:bottom w:w="40" w:type="dxa"/>
-              <w:left w:w="50" w:type="dxa"/>
-              <w:right w:w="50" w:type="dxa"/>
+              <w:top w:w="30" w:type="dxa"/>
+              <w:bottom w:w="30" w:type="dxa"/>
+              <w:left w:w="40" w:type="dxa"/>
+              <w:right w:w="40" w:type="dxa"/>
             </w:tcMar>
           </w:tcPr>
           <w:p>
@@ -1847,7 +1847,7 @@
                 <w:rFonts w:ascii="Times New Roman" w:hAnsi="Times New Roman"/>
                 <w:b w:val="0"/>
                 <w:i w:val="0"/>
-                <w:sz w:val="21"/>
+                <w:sz w:val="20"/>
               </w:rPr>
               <w:t>17</w:t>
             </w:r>
@@ -1859,10 +1859,10 @@
           <w:tcPr>
             <w:tcW w:type="dxa" w:w="4320"/>
             <w:tcMar>
-              <w:top w:w="40" w:type="dxa"/>
-              <w:bottom w:w="40" w:type="dxa"/>
-              <w:left w:w="50" w:type="dxa"/>
-              <w:right w:w="50" w:type="dxa"/>
+              <w:top w:w="30" w:type="dxa"/>
+              <w:bottom w:w="30" w:type="dxa"/>
+              <w:left w:w="40" w:type="dxa"/>
+              <w:right w:w="40" w:type="dxa"/>
             </w:tcMar>
           </w:tcPr>
           <w:p>
@@ -1871,7 +1871,7 @@
                 <w:rFonts w:ascii="Times New Roman" w:hAnsi="Times New Roman"/>
                 <w:b w:val="0"/>
                 <w:i w:val="0"/>
-                <w:sz w:val="21"/>
+                <w:sz w:val="20"/>
               </w:rPr>
               <w:t xml:space="preserve">   3.4 Activity Diagram &amp; Operational Lifecycle</w:t>
             </w:r>
@@ -1881,10 +1881,10 @@
           <w:tcPr>
             <w:tcW w:type="dxa" w:w="4320"/>
             <w:tcMar>
-              <w:top w:w="40" w:type="dxa"/>
-              <w:bottom w:w="40" w:type="dxa"/>
-              <w:left w:w="50" w:type="dxa"/>
-              <w:right w:w="50" w:type="dxa"/>
+              <w:top w:w="30" w:type="dxa"/>
+              <w:bottom w:w="30" w:type="dxa"/>
+              <w:left w:w="40" w:type="dxa"/>
+              <w:right w:w="40" w:type="dxa"/>
             </w:tcMar>
           </w:tcPr>
           <w:p>
@@ -1896,7 +1896,7 @@
                 <w:rFonts w:ascii="Times New Roman" w:hAnsi="Times New Roman"/>
                 <w:b w:val="0"/>
                 <w:i w:val="0"/>
-                <w:sz w:val="21"/>
+                <w:sz w:val="20"/>
               </w:rPr>
               <w:t>19</w:t>
             </w:r>
@@ -1908,10 +1908,10 @@
           <w:tcPr>
             <w:tcW w:type="dxa" w:w="4320"/>
             <w:tcMar>
-              <w:top w:w="40" w:type="dxa"/>
-              <w:bottom w:w="40" w:type="dxa"/>
-              <w:left w:w="50" w:type="dxa"/>
-              <w:right w:w="50" w:type="dxa"/>
+              <w:top w:w="30" w:type="dxa"/>
+              <w:bottom w:w="30" w:type="dxa"/>
+              <w:left w:w="40" w:type="dxa"/>
+              <w:right w:w="40" w:type="dxa"/>
             </w:tcMar>
           </w:tcPr>
           <w:p>
@@ -1920,7 +1920,7 @@
                 <w:rFonts w:ascii="Times New Roman" w:hAnsi="Times New Roman"/>
                 <w:b w:val="0"/>
                 <w:i w:val="0"/>
-                <w:sz w:val="21"/>
+                <w:sz w:val="20"/>
               </w:rPr>
               <w:t xml:space="preserve">   3.5 Class Diagram &amp; Detailed Component Structure</w:t>
             </w:r>
@@ -1930,10 +1930,10 @@
           <w:tcPr>
             <w:tcW w:type="dxa" w:w="4320"/>
             <w:tcMar>
-              <w:top w:w="40" w:type="dxa"/>
-              <w:bottom w:w="40" w:type="dxa"/>
-              <w:left w:w="50" w:type="dxa"/>
-              <w:right w:w="50" w:type="dxa"/>
+              <w:top w:w="30" w:type="dxa"/>
+              <w:bottom w:w="30" w:type="dxa"/>
+              <w:left w:w="40" w:type="dxa"/>
+              <w:right w:w="40" w:type="dxa"/>
             </w:tcMar>
           </w:tcPr>
           <w:p>
@@ -1945,7 +1945,7 @@
                 <w:rFonts w:ascii="Times New Roman" w:hAnsi="Times New Roman"/>
                 <w:b w:val="0"/>
                 <w:i w:val="0"/>
-                <w:sz w:val="21"/>
+                <w:sz w:val="20"/>
               </w:rPr>
               <w:t>21</w:t>
             </w:r>
@@ -1957,10 +1957,10 @@
           <w:tcPr>
             <w:tcW w:type="dxa" w:w="4320"/>
             <w:tcMar>
-              <w:top w:w="40" w:type="dxa"/>
-              <w:bottom w:w="40" w:type="dxa"/>
-              <w:left w:w="50" w:type="dxa"/>
-              <w:right w:w="50" w:type="dxa"/>
+              <w:top w:w="30" w:type="dxa"/>
+              <w:bottom w:w="30" w:type="dxa"/>
+              <w:left w:w="40" w:type="dxa"/>
+              <w:right w:w="40" w:type="dxa"/>
             </w:tcMar>
           </w:tcPr>
           <w:p>
@@ -1969,7 +1969,7 @@
                 <w:rFonts w:ascii="Times New Roman" w:hAnsi="Times New Roman"/>
                 <w:b/>
                 <w:i w:val="0"/>
-                <w:sz w:val="21"/>
+                <w:sz w:val="20"/>
               </w:rPr>
               <w:t>4. SYSTEM DESIGN</w:t>
             </w:r>
@@ -1979,10 +1979,10 @@
           <w:tcPr>
             <w:tcW w:type="dxa" w:w="4320"/>
             <w:tcMar>
-              <w:top w:w="40" w:type="dxa"/>
-              <w:bottom w:w="40" w:type="dxa"/>
-              <w:left w:w="50" w:type="dxa"/>
-              <w:right w:w="50" w:type="dxa"/>
+              <w:top w:w="30" w:type="dxa"/>
+              <w:bottom w:w="30" w:type="dxa"/>
+              <w:left w:w="40" w:type="dxa"/>
+              <w:right w:w="40" w:type="dxa"/>
             </w:tcMar>
           </w:tcPr>
           <w:p>
@@ -1994,7 +1994,7 @@
                 <w:rFonts w:ascii="Times New Roman" w:hAnsi="Times New Roman"/>
                 <w:b/>
                 <w:i w:val="0"/>
-                <w:sz w:val="21"/>
+                <w:sz w:val="20"/>
               </w:rPr>
               <w:t>23</w:t>
             </w:r>
@@ -2006,10 +2006,10 @@
           <w:tcPr>
             <w:tcW w:type="dxa" w:w="4320"/>
             <w:tcMar>
-              <w:top w:w="40" w:type="dxa"/>
-              <w:bottom w:w="40" w:type="dxa"/>
-              <w:left w:w="50" w:type="dxa"/>
-              <w:right w:w="50" w:type="dxa"/>
+              <w:top w:w="30" w:type="dxa"/>
+              <w:bottom w:w="30" w:type="dxa"/>
+              <w:left w:w="40" w:type="dxa"/>
+              <w:right w:w="40" w:type="dxa"/>
             </w:tcMar>
           </w:tcPr>
           <w:p>
@@ -2018,7 +2018,7 @@
                 <w:rFonts w:ascii="Times New Roman" w:hAnsi="Times New Roman"/>
                 <w:b w:val="0"/>
                 <w:i w:val="0"/>
-                <w:sz w:val="21"/>
+                <w:sz w:val="20"/>
               </w:rPr>
               <w:t xml:space="preserve">   4.1 Architectural Design (Four-Tier Architecture &amp; Description)</w:t>
             </w:r>
@@ -2028,10 +2028,10 @@
           <w:tcPr>
             <w:tcW w:type="dxa" w:w="4320"/>
             <w:tcMar>
-              <w:top w:w="40" w:type="dxa"/>
-              <w:bottom w:w="40" w:type="dxa"/>
-              <w:left w:w="50" w:type="dxa"/>
-              <w:right w:w="50" w:type="dxa"/>
+              <w:top w:w="30" w:type="dxa"/>
+              <w:bottom w:w="30" w:type="dxa"/>
+              <w:left w:w="40" w:type="dxa"/>
+              <w:right w:w="40" w:type="dxa"/>
             </w:tcMar>
           </w:tcPr>
           <w:p>
@@ -2043,7 +2043,7 @@
                 <w:rFonts w:ascii="Times New Roman" w:hAnsi="Times New Roman"/>
                 <w:b w:val="0"/>
                 <w:i w:val="0"/>
-                <w:sz w:val="21"/>
+                <w:sz w:val="20"/>
               </w:rPr>
               <w:t>23</w:t>
             </w:r>
@@ -2055,10 +2055,10 @@
           <w:tcPr>
             <w:tcW w:type="dxa" w:w="4320"/>
             <w:tcMar>
-              <w:top w:w="40" w:type="dxa"/>
-              <w:bottom w:w="40" w:type="dxa"/>
-              <w:left w:w="50" w:type="dxa"/>
-              <w:right w:w="50" w:type="dxa"/>
+              <w:top w:w="30" w:type="dxa"/>
+              <w:bottom w:w="30" w:type="dxa"/>
+              <w:left w:w="40" w:type="dxa"/>
+              <w:right w:w="40" w:type="dxa"/>
             </w:tcMar>
           </w:tcPr>
           <w:p>
@@ -2067,7 +2067,7 @@
                 <w:rFonts w:ascii="Times New Roman" w:hAnsi="Times New Roman"/>
                 <w:b w:val="0"/>
                 <w:i w:val="0"/>
-                <w:sz w:val="21"/>
+                <w:sz w:val="20"/>
               </w:rPr>
               <w:t xml:space="preserve">   4.2 Database &amp; Graph Schema Design (Data Dictionary &amp; Normalization)</w:t>
             </w:r>
@@ -2077,10 +2077,10 @@
           <w:tcPr>
             <w:tcW w:type="dxa" w:w="4320"/>
             <w:tcMar>
-              <w:top w:w="40" w:type="dxa"/>
-              <w:bottom w:w="40" w:type="dxa"/>
-              <w:left w:w="50" w:type="dxa"/>
-              <w:right w:w="50" w:type="dxa"/>
+              <w:top w:w="30" w:type="dxa"/>
+              <w:bottom w:w="30" w:type="dxa"/>
+              <w:left w:w="40" w:type="dxa"/>
+              <w:right w:w="40" w:type="dxa"/>
             </w:tcMar>
           </w:tcPr>
           <w:p>
@@ -2092,7 +2092,7 @@
                 <w:rFonts w:ascii="Times New Roman" w:hAnsi="Times New Roman"/>
                 <w:b w:val="0"/>
                 <w:i w:val="0"/>
-                <w:sz w:val="21"/>
+                <w:sz w:val="20"/>
               </w:rPr>
               <w:t>25</w:t>
             </w:r>
@@ -2104,10 +2104,10 @@
           <w:tcPr>
             <w:tcW w:type="dxa" w:w="4320"/>
             <w:tcMar>
-              <w:top w:w="40" w:type="dxa"/>
-              <w:bottom w:w="40" w:type="dxa"/>
-              <w:left w:w="50" w:type="dxa"/>
-              <w:right w:w="50" w:type="dxa"/>
+              <w:top w:w="30" w:type="dxa"/>
+              <w:bottom w:w="30" w:type="dxa"/>
+              <w:left w:w="40" w:type="dxa"/>
+              <w:right w:w="40" w:type="dxa"/>
             </w:tcMar>
           </w:tcPr>
           <w:p>
@@ -2116,7 +2116,7 @@
                 <w:rFonts w:ascii="Times New Roman" w:hAnsi="Times New Roman"/>
                 <w:b w:val="0"/>
                 <w:i w:val="0"/>
-                <w:sz w:val="21"/>
+                <w:sz w:val="20"/>
               </w:rPr>
               <w:t xml:space="preserve">   4.3 Component &amp; Deployment Design (Docker Containers &amp; Ports)</w:t>
             </w:r>
@@ -2126,10 +2126,10 @@
           <w:tcPr>
             <w:tcW w:type="dxa" w:w="4320"/>
             <w:tcMar>
-              <w:top w:w="40" w:type="dxa"/>
-              <w:bottom w:w="40" w:type="dxa"/>
-              <w:left w:w="50" w:type="dxa"/>
-              <w:right w:w="50" w:type="dxa"/>
+              <w:top w:w="30" w:type="dxa"/>
+              <w:bottom w:w="30" w:type="dxa"/>
+              <w:left w:w="40" w:type="dxa"/>
+              <w:right w:w="40" w:type="dxa"/>
             </w:tcMar>
           </w:tcPr>
           <w:p>
@@ -2141,7 +2141,7 @@
                 <w:rFonts w:ascii="Times New Roman" w:hAnsi="Times New Roman"/>
                 <w:b w:val="0"/>
                 <w:i w:val="0"/>
-                <w:sz w:val="21"/>
+                <w:sz w:val="20"/>
               </w:rPr>
               <w:t>27</w:t>
             </w:r>
@@ -2153,10 +2153,10 @@
           <w:tcPr>
             <w:tcW w:type="dxa" w:w="4320"/>
             <w:tcMar>
-              <w:top w:w="40" w:type="dxa"/>
-              <w:bottom w:w="40" w:type="dxa"/>
-              <w:left w:w="50" w:type="dxa"/>
-              <w:right w:w="50" w:type="dxa"/>
+              <w:top w:w="30" w:type="dxa"/>
+              <w:bottom w:w="30" w:type="dxa"/>
+              <w:left w:w="40" w:type="dxa"/>
+              <w:right w:w="40" w:type="dxa"/>
             </w:tcMar>
           </w:tcPr>
           <w:p>
@@ -2165,7 +2165,7 @@
                 <w:rFonts w:ascii="Times New Roman" w:hAnsi="Times New Roman"/>
                 <w:b w:val="0"/>
                 <w:i w:val="0"/>
-                <w:sz w:val="21"/>
+                <w:sz w:val="20"/>
               </w:rPr>
               <w:t xml:space="preserve">   4.4 Interface Design (Hardware Canvas, HUD, Ingestion Modal)</w:t>
             </w:r>
@@ -2175,10 +2175,10 @@
           <w:tcPr>
             <w:tcW w:type="dxa" w:w="4320"/>
             <w:tcMar>
-              <w:top w:w="40" w:type="dxa"/>
-              <w:bottom w:w="40" w:type="dxa"/>
-              <w:left w:w="50" w:type="dxa"/>
-              <w:right w:w="50" w:type="dxa"/>
+              <w:top w:w="30" w:type="dxa"/>
+              <w:bottom w:w="30" w:type="dxa"/>
+              <w:left w:w="40" w:type="dxa"/>
+              <w:right w:w="40" w:type="dxa"/>
             </w:tcMar>
           </w:tcPr>
           <w:p>
@@ -2190,7 +2190,7 @@
                 <w:rFonts w:ascii="Times New Roman" w:hAnsi="Times New Roman"/>
                 <w:b w:val="0"/>
                 <w:i w:val="0"/>
-                <w:sz w:val="21"/>
+                <w:sz w:val="20"/>
               </w:rPr>
               <w:t>29</w:t>
             </w:r>
@@ -2202,10 +2202,10 @@
           <w:tcPr>
             <w:tcW w:type="dxa" w:w="4320"/>
             <w:tcMar>
-              <w:top w:w="40" w:type="dxa"/>
-              <w:bottom w:w="40" w:type="dxa"/>
-              <w:left w:w="50" w:type="dxa"/>
-              <w:right w:w="50" w:type="dxa"/>
+              <w:top w:w="30" w:type="dxa"/>
+              <w:bottom w:w="30" w:type="dxa"/>
+              <w:left w:w="40" w:type="dxa"/>
+              <w:right w:w="40" w:type="dxa"/>
             </w:tcMar>
           </w:tcPr>
           <w:p>
@@ -2214,7 +2214,7 @@
                 <w:rFonts w:ascii="Times New Roman" w:hAnsi="Times New Roman"/>
                 <w:b/>
                 <w:i w:val="0"/>
-                <w:sz w:val="21"/>
+                <w:sz w:val="20"/>
               </w:rPr>
               <w:t>5. SYSTEM IMPLEMENTATION</w:t>
             </w:r>
@@ -2224,10 +2224,10 @@
           <w:tcPr>
             <w:tcW w:type="dxa" w:w="4320"/>
             <w:tcMar>
-              <w:top w:w="40" w:type="dxa"/>
-              <w:bottom w:w="40" w:type="dxa"/>
-              <w:left w:w="50" w:type="dxa"/>
-              <w:right w:w="50" w:type="dxa"/>
+              <w:top w:w="30" w:type="dxa"/>
+              <w:bottom w:w="30" w:type="dxa"/>
+              <w:left w:w="40" w:type="dxa"/>
+              <w:right w:w="40" w:type="dxa"/>
             </w:tcMar>
           </w:tcPr>
           <w:p>
@@ -2239,7 +2239,7 @@
                 <w:rFonts w:ascii="Times New Roman" w:hAnsi="Times New Roman"/>
                 <w:b/>
                 <w:i w:val="0"/>
-                <w:sz w:val="21"/>
+                <w:sz w:val="20"/>
               </w:rPr>
               <w:t>32</w:t>
             </w:r>
@@ -2251,10 +2251,10 @@
           <w:tcPr>
             <w:tcW w:type="dxa" w:w="4320"/>
             <w:tcMar>
-              <w:top w:w="40" w:type="dxa"/>
-              <w:bottom w:w="40" w:type="dxa"/>
-              <w:left w:w="50" w:type="dxa"/>
-              <w:right w:w="50" w:type="dxa"/>
+              <w:top w:w="30" w:type="dxa"/>
+              <w:bottom w:w="30" w:type="dxa"/>
+              <w:left w:w="40" w:type="dxa"/>
+              <w:right w:w="40" w:type="dxa"/>
             </w:tcMar>
           </w:tcPr>
           <w:p>
@@ -2263,7 +2263,7 @@
                 <w:rFonts w:ascii="Times New Roman" w:hAnsi="Times New Roman"/>
                 <w:b w:val="0"/>
                 <w:i w:val="0"/>
-                <w:sz w:val="21"/>
+                <w:sz w:val="20"/>
               </w:rPr>
               <w:t xml:space="preserve">   5.1 Languages, Database Systems &amp; Core Frameworks Used</w:t>
             </w:r>
@@ -2273,10 +2273,10 @@
           <w:tcPr>
             <w:tcW w:type="dxa" w:w="4320"/>
             <w:tcMar>
-              <w:top w:w="40" w:type="dxa"/>
-              <w:bottom w:w="40" w:type="dxa"/>
-              <w:left w:w="50" w:type="dxa"/>
-              <w:right w:w="50" w:type="dxa"/>
+              <w:top w:w="30" w:type="dxa"/>
+              <w:bottom w:w="30" w:type="dxa"/>
+              <w:left w:w="40" w:type="dxa"/>
+              <w:right w:w="40" w:type="dxa"/>
             </w:tcMar>
           </w:tcPr>
           <w:p>
@@ -2288,7 +2288,7 @@
                 <w:rFonts w:ascii="Times New Roman" w:hAnsi="Times New Roman"/>
                 <w:b w:val="0"/>
                 <w:i w:val="0"/>
-                <w:sz w:val="21"/>
+                <w:sz w:val="20"/>
               </w:rPr>
               <w:t>32</w:t>
             </w:r>
@@ -2300,10 +2300,10 @@
           <w:tcPr>
             <w:tcW w:type="dxa" w:w="4320"/>
             <w:tcMar>
-              <w:top w:w="40" w:type="dxa"/>
-              <w:bottom w:w="40" w:type="dxa"/>
-              <w:left w:w="50" w:type="dxa"/>
-              <w:right w:w="50" w:type="dxa"/>
+              <w:top w:w="30" w:type="dxa"/>
+              <w:bottom w:w="30" w:type="dxa"/>
+              <w:left w:w="40" w:type="dxa"/>
+              <w:right w:w="40" w:type="dxa"/>
             </w:tcMar>
           </w:tcPr>
           <w:p>
@@ -2312,7 +2312,7 @@
                 <w:rFonts w:ascii="Times New Roman" w:hAnsi="Times New Roman"/>
                 <w:b w:val="0"/>
                 <w:i w:val="0"/>
-                <w:sz w:val="21"/>
+                <w:sz w:val="20"/>
               </w:rPr>
               <w:t xml:space="preserve">   5.2 Features of Core Technologies (NetworkX, Memgraph, Redpanda)</w:t>
             </w:r>
@@ -2322,10 +2322,10 @@
           <w:tcPr>
             <w:tcW w:type="dxa" w:w="4320"/>
             <w:tcMar>
-              <w:top w:w="40" w:type="dxa"/>
-              <w:bottom w:w="40" w:type="dxa"/>
-              <w:left w:w="50" w:type="dxa"/>
-              <w:right w:w="50" w:type="dxa"/>
+              <w:top w:w="30" w:type="dxa"/>
+              <w:bottom w:w="30" w:type="dxa"/>
+              <w:left w:w="40" w:type="dxa"/>
+              <w:right w:w="40" w:type="dxa"/>
             </w:tcMar>
           </w:tcPr>
           <w:p>
@@ -2337,7 +2337,7 @@
                 <w:rFonts w:ascii="Times New Roman" w:hAnsi="Times New Roman"/>
                 <w:b w:val="0"/>
                 <w:i w:val="0"/>
-                <w:sz w:val="21"/>
+                <w:sz w:val="20"/>
               </w:rPr>
               <w:t>33</w:t>
             </w:r>
@@ -2349,10 +2349,10 @@
           <w:tcPr>
             <w:tcW w:type="dxa" w:w="4320"/>
             <w:tcMar>
-              <w:top w:w="40" w:type="dxa"/>
-              <w:bottom w:w="40" w:type="dxa"/>
-              <w:left w:w="50" w:type="dxa"/>
-              <w:right w:w="50" w:type="dxa"/>
+              <w:top w:w="30" w:type="dxa"/>
+              <w:bottom w:w="30" w:type="dxa"/>
+              <w:left w:w="40" w:type="dxa"/>
+              <w:right w:w="40" w:type="dxa"/>
             </w:tcMar>
           </w:tcPr>
           <w:p>
@@ -2361,7 +2361,7 @@
                 <w:rFonts w:ascii="Times New Roman" w:hAnsi="Times New Roman"/>
                 <w:b w:val="0"/>
                 <w:i w:val="0"/>
-                <w:sz w:val="21"/>
+                <w:sz w:val="20"/>
               </w:rPr>
               <w:t xml:space="preserve">   5.3 Third-Party Tools &amp; API Integration (Boto3, BloodHound, EPSS, KEV)</w:t>
             </w:r>
@@ -2371,10 +2371,10 @@
           <w:tcPr>
             <w:tcW w:type="dxa" w:w="4320"/>
             <w:tcMar>
-              <w:top w:w="40" w:type="dxa"/>
-              <w:bottom w:w="40" w:type="dxa"/>
-              <w:left w:w="50" w:type="dxa"/>
-              <w:right w:w="50" w:type="dxa"/>
+              <w:top w:w="30" w:type="dxa"/>
+              <w:bottom w:w="30" w:type="dxa"/>
+              <w:left w:w="40" w:type="dxa"/>
+              <w:right w:w="40" w:type="dxa"/>
             </w:tcMar>
           </w:tcPr>
           <w:p>
@@ -2386,7 +2386,7 @@
                 <w:rFonts w:ascii="Times New Roman" w:hAnsi="Times New Roman"/>
                 <w:b w:val="0"/>
                 <w:i w:val="0"/>
-                <w:sz w:val="21"/>
+                <w:sz w:val="20"/>
               </w:rPr>
               <w:t>34</w:t>
             </w:r>
@@ -2398,10 +2398,10 @@
           <w:tcPr>
             <w:tcW w:type="dxa" w:w="4320"/>
             <w:tcMar>
-              <w:top w:w="40" w:type="dxa"/>
-              <w:bottom w:w="40" w:type="dxa"/>
-              <w:left w:w="50" w:type="dxa"/>
-              <w:right w:w="50" w:type="dxa"/>
+              <w:top w:w="30" w:type="dxa"/>
+              <w:bottom w:w="30" w:type="dxa"/>
+              <w:left w:w="40" w:type="dxa"/>
+              <w:right w:w="40" w:type="dxa"/>
             </w:tcMar>
           </w:tcPr>
           <w:p>
@@ -2410,7 +2410,7 @@
                 <w:rFonts w:ascii="Times New Roman" w:hAnsi="Times New Roman"/>
                 <w:b/>
                 <w:i w:val="0"/>
-                <w:sz w:val="21"/>
+                <w:sz w:val="20"/>
               </w:rPr>
               <w:t>6. TESTING AND VERIFICATION</w:t>
             </w:r>
@@ -2420,10 +2420,10 @@
           <w:tcPr>
             <w:tcW w:type="dxa" w:w="4320"/>
             <w:tcMar>
-              <w:top w:w="40" w:type="dxa"/>
-              <w:bottom w:w="40" w:type="dxa"/>
-              <w:left w:w="50" w:type="dxa"/>
-              <w:right w:w="50" w:type="dxa"/>
+              <w:top w:w="30" w:type="dxa"/>
+              <w:bottom w:w="30" w:type="dxa"/>
+              <w:left w:w="40" w:type="dxa"/>
+              <w:right w:w="40" w:type="dxa"/>
             </w:tcMar>
           </w:tcPr>
           <w:p>
@@ -2435,7 +2435,7 @@
                 <w:rFonts w:ascii="Times New Roman" w:hAnsi="Times New Roman"/>
                 <w:b/>
                 <w:i w:val="0"/>
-                <w:sz w:val="21"/>
+                <w:sz w:val="20"/>
               </w:rPr>
               <w:t>36</w:t>
             </w:r>
@@ -2447,10 +2447,10 @@
           <w:tcPr>
             <w:tcW w:type="dxa" w:w="4320"/>
             <w:tcMar>
-              <w:top w:w="40" w:type="dxa"/>
-              <w:bottom w:w="40" w:type="dxa"/>
-              <w:left w:w="50" w:type="dxa"/>
-              <w:right w:w="50" w:type="dxa"/>
+              <w:top w:w="30" w:type="dxa"/>
+              <w:bottom w:w="30" w:type="dxa"/>
+              <w:left w:w="40" w:type="dxa"/>
+              <w:right w:w="40" w:type="dxa"/>
             </w:tcMar>
           </w:tcPr>
           <w:p>
@@ -2459,7 +2459,7 @@
                 <w:rFonts w:ascii="Times New Roman" w:hAnsi="Times New Roman"/>
                 <w:b w:val="0"/>
                 <w:i w:val="0"/>
-                <w:sz w:val="21"/>
+                <w:sz w:val="20"/>
               </w:rPr>
               <w:t xml:space="preserve">   6.1 White Box Testing (Algorithmic Logic, Session Parsing, Loops)</w:t>
             </w:r>
@@ -2469,10 +2469,10 @@
           <w:tcPr>
             <w:tcW w:type="dxa" w:w="4320"/>
             <w:tcMar>
-              <w:top w:w="40" w:type="dxa"/>
-              <w:bottom w:w="40" w:type="dxa"/>
-              <w:left w:w="50" w:type="dxa"/>
-              <w:right w:w="50" w:type="dxa"/>
+              <w:top w:w="30" w:type="dxa"/>
+              <w:bottom w:w="30" w:type="dxa"/>
+              <w:left w:w="40" w:type="dxa"/>
+              <w:right w:w="40" w:type="dxa"/>
             </w:tcMar>
           </w:tcPr>
           <w:p>
@@ -2484,7 +2484,7 @@
                 <w:rFonts w:ascii="Times New Roman" w:hAnsi="Times New Roman"/>
                 <w:b w:val="0"/>
                 <w:i w:val="0"/>
-                <w:sz w:val="21"/>
+                <w:sz w:val="20"/>
               </w:rPr>
               <w:t>36</w:t>
             </w:r>
@@ -2496,10 +2496,10 @@
           <w:tcPr>
             <w:tcW w:type="dxa" w:w="4320"/>
             <w:tcMar>
-              <w:top w:w="40" w:type="dxa"/>
-              <w:bottom w:w="40" w:type="dxa"/>
-              <w:left w:w="50" w:type="dxa"/>
-              <w:right w:w="50" w:type="dxa"/>
+              <w:top w:w="30" w:type="dxa"/>
+              <w:bottom w:w="30" w:type="dxa"/>
+              <w:left w:w="40" w:type="dxa"/>
+              <w:right w:w="40" w:type="dxa"/>
             </w:tcMar>
           </w:tcPr>
           <w:p>
@@ -2508,7 +2508,7 @@
                 <w:rFonts w:ascii="Times New Roman" w:hAnsi="Times New Roman"/>
                 <w:b w:val="0"/>
                 <w:i w:val="0"/>
-                <w:sz w:val="21"/>
+                <w:sz w:val="20"/>
               </w:rPr>
               <w:t xml:space="preserve">   6.2 Black Box Testing (Boundary Discovery, REST Endpoints, SSE)</w:t>
             </w:r>
@@ -2518,10 +2518,10 @@
           <w:tcPr>
             <w:tcW w:type="dxa" w:w="4320"/>
             <w:tcMar>
-              <w:top w:w="40" w:type="dxa"/>
-              <w:bottom w:w="40" w:type="dxa"/>
-              <w:left w:w="50" w:type="dxa"/>
-              <w:right w:w="50" w:type="dxa"/>
+              <w:top w:w="30" w:type="dxa"/>
+              <w:bottom w:w="30" w:type="dxa"/>
+              <w:left w:w="40" w:type="dxa"/>
+              <w:right w:w="40" w:type="dxa"/>
             </w:tcMar>
           </w:tcPr>
           <w:p>
@@ -2533,7 +2533,7 @@
                 <w:rFonts w:ascii="Times New Roman" w:hAnsi="Times New Roman"/>
                 <w:b w:val="0"/>
                 <w:i w:val="0"/>
-                <w:sz w:val="21"/>
+                <w:sz w:val="20"/>
               </w:rPr>
               <w:t>37</w:t>
             </w:r>
@@ -2545,10 +2545,10 @@
           <w:tcPr>
             <w:tcW w:type="dxa" w:w="4320"/>
             <w:tcMar>
-              <w:top w:w="40" w:type="dxa"/>
-              <w:bottom w:w="40" w:type="dxa"/>
-              <w:left w:w="50" w:type="dxa"/>
-              <w:right w:w="50" w:type="dxa"/>
+              <w:top w:w="30" w:type="dxa"/>
+              <w:bottom w:w="30" w:type="dxa"/>
+              <w:left w:w="40" w:type="dxa"/>
+              <w:right w:w="40" w:type="dxa"/>
             </w:tcMar>
           </w:tcPr>
           <w:p>
@@ -2557,7 +2557,7 @@
                 <w:rFonts w:ascii="Times New Roman" w:hAnsi="Times New Roman"/>
                 <w:b w:val="0"/>
                 <w:i w:val="0"/>
-                <w:sz w:val="21"/>
+                <w:sz w:val="20"/>
               </w:rPr>
               <w:t xml:space="preserve">   6.3 Test Cases, Execution Procedures and Empirical Results</w:t>
             </w:r>
@@ -2567,10 +2567,10 @@
           <w:tcPr>
             <w:tcW w:type="dxa" w:w="4320"/>
             <w:tcMar>
-              <w:top w:w="40" w:type="dxa"/>
-              <w:bottom w:w="40" w:type="dxa"/>
-              <w:left w:w="50" w:type="dxa"/>
-              <w:right w:w="50" w:type="dxa"/>
+              <w:top w:w="30" w:type="dxa"/>
+              <w:bottom w:w="30" w:type="dxa"/>
+              <w:left w:w="40" w:type="dxa"/>
+              <w:right w:w="40" w:type="dxa"/>
             </w:tcMar>
           </w:tcPr>
           <w:p>
@@ -2582,7 +2582,7 @@
                 <w:rFonts w:ascii="Times New Roman" w:hAnsi="Times New Roman"/>
                 <w:b w:val="0"/>
                 <w:i w:val="0"/>
-                <w:sz w:val="21"/>
+                <w:sz w:val="20"/>
               </w:rPr>
               <w:t>38</w:t>
             </w:r>
@@ -2594,10 +2594,10 @@
           <w:tcPr>
             <w:tcW w:type="dxa" w:w="4320"/>
             <w:tcMar>
-              <w:top w:w="40" w:type="dxa"/>
-              <w:bottom w:w="40" w:type="dxa"/>
-              <w:left w:w="50" w:type="dxa"/>
-              <w:right w:w="50" w:type="dxa"/>
+              <w:top w:w="30" w:type="dxa"/>
+              <w:bottom w:w="30" w:type="dxa"/>
+              <w:left w:w="40" w:type="dxa"/>
+              <w:right w:w="40" w:type="dxa"/>
             </w:tcMar>
           </w:tcPr>
           <w:p>
@@ -2606,7 +2606,7 @@
                 <w:rFonts w:ascii="Times New Roman" w:hAnsi="Times New Roman"/>
                 <w:b/>
                 <w:i w:val="0"/>
-                <w:sz w:val="21"/>
+                <w:sz w:val="20"/>
               </w:rPr>
               <w:t>7. FUTURE SCOPE AND LIMITATIONS</w:t>
             </w:r>
@@ -2616,10 +2616,10 @@
           <w:tcPr>
             <w:tcW w:type="dxa" w:w="4320"/>
             <w:tcMar>
-              <w:top w:w="40" w:type="dxa"/>
-              <w:bottom w:w="40" w:type="dxa"/>
-              <w:left w:w="50" w:type="dxa"/>
-              <w:right w:w="50" w:type="dxa"/>
+              <w:top w:w="30" w:type="dxa"/>
+              <w:bottom w:w="30" w:type="dxa"/>
+              <w:left w:w="40" w:type="dxa"/>
+              <w:right w:w="40" w:type="dxa"/>
             </w:tcMar>
           </w:tcPr>
           <w:p>
@@ -2631,7 +2631,7 @@
                 <w:rFonts w:ascii="Times New Roman" w:hAnsi="Times New Roman"/>
                 <w:b/>
                 <w:i w:val="0"/>
-                <w:sz w:val="21"/>
+                <w:sz w:val="20"/>
               </w:rPr>
               <w:t>42</w:t>
             </w:r>
@@ -2643,10 +2643,10 @@
           <w:tcPr>
             <w:tcW w:type="dxa" w:w="4320"/>
             <w:tcMar>
-              <w:top w:w="40" w:type="dxa"/>
-              <w:bottom w:w="40" w:type="dxa"/>
-              <w:left w:w="50" w:type="dxa"/>
-              <w:right w:w="50" w:type="dxa"/>
+              <w:top w:w="30" w:type="dxa"/>
+              <w:bottom w:w="30" w:type="dxa"/>
+              <w:left w:w="40" w:type="dxa"/>
+              <w:right w:w="40" w:type="dxa"/>
             </w:tcMar>
           </w:tcPr>
           <w:p>
@@ -2655,7 +2655,7 @@
                 <w:rFonts w:ascii="Times New Roman" w:hAnsi="Times New Roman"/>
                 <w:b/>
                 <w:i w:val="0"/>
-                <w:sz w:val="21"/>
+                <w:sz w:val="20"/>
               </w:rPr>
               <w:t>8. CONCLUSION</w:t>
             </w:r>
@@ -2665,10 +2665,10 @@
           <w:tcPr>
             <w:tcW w:type="dxa" w:w="4320"/>
             <w:tcMar>
-              <w:top w:w="40" w:type="dxa"/>
-              <w:bottom w:w="40" w:type="dxa"/>
-              <w:left w:w="50" w:type="dxa"/>
-              <w:right w:w="50" w:type="dxa"/>
+              <w:top w:w="30" w:type="dxa"/>
+              <w:bottom w:w="30" w:type="dxa"/>
+              <w:left w:w="40" w:type="dxa"/>
+              <w:right w:w="40" w:type="dxa"/>
             </w:tcMar>
           </w:tcPr>
           <w:p>
@@ -2680,7 +2680,7 @@
                 <w:rFonts w:ascii="Times New Roman" w:hAnsi="Times New Roman"/>
                 <w:b/>
                 <w:i w:val="0"/>
-                <w:sz w:val="21"/>
+                <w:sz w:val="20"/>
               </w:rPr>
               <w:t>44</w:t>
             </w:r>
@@ -2692,10 +2692,10 @@
           <w:tcPr>
             <w:tcW w:type="dxa" w:w="4320"/>
             <w:tcMar>
-              <w:top w:w="40" w:type="dxa"/>
-              <w:bottom w:w="40" w:type="dxa"/>
-              <w:left w:w="50" w:type="dxa"/>
-              <w:right w:w="50" w:type="dxa"/>
+              <w:top w:w="30" w:type="dxa"/>
+              <w:bottom w:w="30" w:type="dxa"/>
+              <w:left w:w="40" w:type="dxa"/>
+              <w:right w:w="40" w:type="dxa"/>
             </w:tcMar>
           </w:tcPr>
           <w:p>
@@ -2704,7 +2704,7 @@
                 <w:rFonts w:ascii="Times New Roman" w:hAnsi="Times New Roman"/>
                 <w:b/>
                 <w:i w:val="0"/>
-                <w:sz w:val="21"/>
+                <w:sz w:val="20"/>
               </w:rPr>
               <w:t>9. REFERENCES</w:t>
             </w:r>
@@ -2714,10 +2714,10 @@
           <w:tcPr>
             <w:tcW w:type="dxa" w:w="4320"/>
             <w:tcMar>
-              <w:top w:w="40" w:type="dxa"/>
-              <w:bottom w:w="40" w:type="dxa"/>
-              <w:left w:w="50" w:type="dxa"/>
-              <w:right w:w="50" w:type="dxa"/>
+              <w:top w:w="30" w:type="dxa"/>
+              <w:bottom w:w="30" w:type="dxa"/>
+              <w:left w:w="40" w:type="dxa"/>
+              <w:right w:w="40" w:type="dxa"/>
             </w:tcMar>
           </w:tcPr>
           <w:p>
@@ -2729,7 +2729,7 @@
                 <w:rFonts w:ascii="Times New Roman" w:hAnsi="Times New Roman"/>
                 <w:b/>
                 <w:i w:val="0"/>
-                <w:sz w:val="21"/>
+                <w:sz w:val="20"/>
               </w:rPr>
               <w:t>46</w:t>
             </w:r>
@@ -2741,10 +2741,10 @@
           <w:tcPr>
             <w:tcW w:type="dxa" w:w="4320"/>
             <w:tcMar>
-              <w:top w:w="40" w:type="dxa"/>
-              <w:bottom w:w="40" w:type="dxa"/>
-              <w:left w:w="50" w:type="dxa"/>
-              <w:right w:w="50" w:type="dxa"/>
+              <w:top w:w="30" w:type="dxa"/>
+              <w:bottom w:w="30" w:type="dxa"/>
+              <w:left w:w="40" w:type="dxa"/>
+              <w:right w:w="40" w:type="dxa"/>
             </w:tcMar>
           </w:tcPr>
           <w:p>
@@ -2753,7 +2753,7 @@
                 <w:rFonts w:ascii="Times New Roman" w:hAnsi="Times New Roman"/>
                 <w:b/>
                 <w:i w:val="0"/>
-                <w:sz w:val="21"/>
+                <w:sz w:val="20"/>
               </w:rPr>
               <w:t>10. APPENDICES</w:t>
             </w:r>
@@ -2763,10 +2763,10 @@
           <w:tcPr>
             <w:tcW w:type="dxa" w:w="4320"/>
             <w:tcMar>
-              <w:top w:w="40" w:type="dxa"/>
-              <w:bottom w:w="40" w:type="dxa"/>
-              <w:left w:w="50" w:type="dxa"/>
-              <w:right w:w="50" w:type="dxa"/>
+              <w:top w:w="30" w:type="dxa"/>
+              <w:bottom w:w="30" w:type="dxa"/>
+              <w:left w:w="40" w:type="dxa"/>
+              <w:right w:w="40" w:type="dxa"/>
             </w:tcMar>
           </w:tcPr>
           <w:p>
@@ -2778,7 +2778,7 @@
                 <w:rFonts w:ascii="Times New Roman" w:hAnsi="Times New Roman"/>
                 <w:b/>
                 <w:i w:val="0"/>
-                <w:sz w:val="21"/>
+                <w:sz w:val="20"/>
               </w:rPr>
               <w:t>48</w:t>
             </w:r>
@@ -2790,10 +2790,10 @@
           <w:tcPr>
             <w:tcW w:type="dxa" w:w="4320"/>
             <w:tcMar>
-              <w:top w:w="40" w:type="dxa"/>
-              <w:bottom w:w="40" w:type="dxa"/>
-              <w:left w:w="50" w:type="dxa"/>
-              <w:right w:w="50" w:type="dxa"/>
+              <w:top w:w="30" w:type="dxa"/>
+              <w:bottom w:w="30" w:type="dxa"/>
+              <w:left w:w="40" w:type="dxa"/>
+              <w:right w:w="40" w:type="dxa"/>
             </w:tcMar>
           </w:tcPr>
           <w:p>
@@ -2802,7 +2802,7 @@
                 <w:rFonts w:ascii="Times New Roman" w:hAnsi="Times New Roman"/>
                 <w:b w:val="0"/>
                 <w:i w:val="0"/>
-                <w:sz w:val="21"/>
+                <w:sz w:val="20"/>
               </w:rPr>
               <w:t xml:space="preserve">   Appendix 1: Deployment &amp; Execution Manual</w:t>
             </w:r>
@@ -2812,10 +2812,10 @@
           <w:tcPr>
             <w:tcW w:type="dxa" w:w="4320"/>
             <w:tcMar>
-              <w:top w:w="40" w:type="dxa"/>
-              <w:bottom w:w="40" w:type="dxa"/>
-              <w:left w:w="50" w:type="dxa"/>
-              <w:right w:w="50" w:type="dxa"/>
+              <w:top w:w="30" w:type="dxa"/>
+              <w:bottom w:w="30" w:type="dxa"/>
+              <w:left w:w="40" w:type="dxa"/>
+              <w:right w:w="40" w:type="dxa"/>
             </w:tcMar>
           </w:tcPr>
           <w:p>
@@ -2827,7 +2827,7 @@
                 <w:rFonts w:ascii="Times New Roman" w:hAnsi="Times New Roman"/>
                 <w:b w:val="0"/>
                 <w:i w:val="0"/>
-                <w:sz w:val="21"/>
+                <w:sz w:val="20"/>
               </w:rPr>
               <w:t>48</w:t>
             </w:r>
@@ -2839,10 +2839,10 @@
           <w:tcPr>
             <w:tcW w:type="dxa" w:w="4320"/>
             <w:tcMar>
-              <w:top w:w="40" w:type="dxa"/>
-              <w:bottom w:w="40" w:type="dxa"/>
-              <w:left w:w="50" w:type="dxa"/>
-              <w:right w:w="50" w:type="dxa"/>
+              <w:top w:w="30" w:type="dxa"/>
+              <w:bottom w:w="30" w:type="dxa"/>
+              <w:left w:w="40" w:type="dxa"/>
+              <w:right w:w="40" w:type="dxa"/>
             </w:tcMar>
           </w:tcPr>
           <w:p>
@@ -2851,7 +2851,7 @@
                 <w:rFonts w:ascii="Times New Roman" w:hAnsi="Times New Roman"/>
                 <w:b w:val="0"/>
                 <w:i w:val="0"/>
-                <w:sz w:val="21"/>
+                <w:sz w:val="20"/>
               </w:rPr>
               <w:t xml:space="preserve">   Appendix 2: Key Algorithms &amp; Implementation Code Snippets</w:t>
             </w:r>
@@ -2861,10 +2861,10 @@
           <w:tcPr>
             <w:tcW w:type="dxa" w:w="4320"/>
             <w:tcMar>
-              <w:top w:w="40" w:type="dxa"/>
-              <w:bottom w:w="40" w:type="dxa"/>
-              <w:left w:w="50" w:type="dxa"/>
-              <w:right w:w="50" w:type="dxa"/>
+              <w:top w:w="30" w:type="dxa"/>
+              <w:bottom w:w="30" w:type="dxa"/>
+              <w:left w:w="40" w:type="dxa"/>
+              <w:right w:w="40" w:type="dxa"/>
             </w:tcMar>
           </w:tcPr>
           <w:p>
@@ -2876,7 +2876,7 @@
                 <w:rFonts w:ascii="Times New Roman" w:hAnsi="Times New Roman"/>
                 <w:b w:val="0"/>
                 <w:i w:val="0"/>
-                <w:sz w:val="21"/>
+                <w:sz w:val="20"/>
               </w:rPr>
               <w:t>50</w:t>
             </w:r>
@@ -2906,7 +2906,7 @@
     </w:p>
     <w:p>
       <w:pPr>
-        <w:spacing w:before="0" w:after="60" w:line="360" w:lineRule="auto"/>
+        <w:spacing w:before="0" w:after="40" w:line="360" w:lineRule="auto"/>
         <w:jc w:val="left"/>
       </w:pPr>
       <w:r>
@@ -2914,14 +2914,14 @@
           <w:rFonts w:ascii="Times New Roman" w:hAnsi="Times New Roman"/>
           <w:b w:val="0"/>
           <w:i w:val="0"/>
-          <w:sz w:val="21"/>
+          <w:sz w:val="20"/>
         </w:rPr>
-        <w:t>Figure 1.1: Enterprise Attack Path Traversal Blindspot ........................................................................ 3</w:t>
+        <w:t>Figure 1.1: Enterprise Attack Path Traversal vs. Flat CVSS Severity List ........................................................................ 3</w:t>
       </w:r>
     </w:p>
     <w:p>
       <w:pPr>
-        <w:spacing w:before="0" w:after="60" w:line="360" w:lineRule="auto"/>
+        <w:spacing w:before="0" w:after="40" w:line="360" w:lineRule="auto"/>
         <w:jc w:val="left"/>
       </w:pPr>
       <w:r>
@@ -2929,14 +2929,14 @@
           <w:rFonts w:ascii="Times New Roman" w:hAnsi="Times New Roman"/>
           <w:b w:val="0"/>
           <w:i w:val="0"/>
-          <w:sz w:val="21"/>
+          <w:sz w:val="20"/>
         </w:rPr>
         <w:t>Figure 3.1: Comprehensive System Use Case Diagram ........................................................................ 16</w:t>
       </w:r>
     </w:p>
     <w:p>
       <w:pPr>
-        <w:spacing w:before="0" w:after="60" w:line="360" w:lineRule="auto"/>
+        <w:spacing w:before="0" w:after="40" w:line="360" w:lineRule="auto"/>
         <w:jc w:val="left"/>
       </w:pPr>
       <w:r>
@@ -2944,14 +2944,14 @@
           <w:rFonts w:ascii="Times New Roman" w:hAnsi="Times New Roman"/>
           <w:b w:val="0"/>
           <w:i w:val="0"/>
-          <w:sz w:val="21"/>
+          <w:sz w:val="20"/>
         </w:rPr>
-        <w:t>Figure 3.2: Asynchronous Batch Database Synchronization Sequence Diagram ........................................................................ 18</w:t>
+        <w:t>Figure 3.2: Real-Time Threat Ingestion &amp; Path Recalculation Sequence Diagram ........................................................................ 18</w:t>
       </w:r>
     </w:p>
     <w:p>
       <w:pPr>
-        <w:spacing w:before="0" w:after="60" w:line="360" w:lineRule="auto"/>
+        <w:spacing w:before="0" w:after="40" w:line="360" w:lineRule="auto"/>
         <w:jc w:val="left"/>
       </w:pPr>
       <w:r>
@@ -2959,14 +2959,14 @@
           <w:rFonts w:ascii="Times New Roman" w:hAnsi="Times New Roman"/>
           <w:b w:val="0"/>
           <w:i w:val="0"/>
-          <w:sz w:val="21"/>
+          <w:sz w:val="20"/>
         </w:rPr>
-        <w:t>Figure 3.3: Real-Time Telemetry &amp; EDR Alert Recalibration Flow ........................................................................ 19</w:t>
+        <w:t>Figure 3.3: Attack Path Calculation &amp; Min-Cut Remediation Flow Activity Diagram ........................................................................ 20</w:t>
       </w:r>
     </w:p>
     <w:p>
       <w:pPr>
-        <w:spacing w:before="0" w:after="60" w:line="360" w:lineRule="auto"/>
+        <w:spacing w:before="0" w:after="40" w:line="360" w:lineRule="auto"/>
         <w:jc w:val="left"/>
       </w:pPr>
       <w:r>
@@ -2974,14 +2974,14 @@
           <w:rFonts w:ascii="Times New Roman" w:hAnsi="Times New Roman"/>
           <w:b w:val="0"/>
           <w:i w:val="0"/>
-          <w:sz w:val="21"/>
+          <w:sz w:val="20"/>
         </w:rPr>
-        <w:t>Figure 3.4: Incident Response &amp; Attack Traversal Activity Diagram ........................................................................ 20</w:t>
+        <w:t>Figure 3.4: Core Object-Oriented Component Class Hierarchy &amp; Object Model ........................................................................ 22</w:t>
       </w:r>
     </w:p>
     <w:p>
       <w:pPr>
-        <w:spacing w:before="0" w:after="60" w:line="360" w:lineRule="auto"/>
+        <w:spacing w:before="0" w:after="40" w:line="360" w:lineRule="auto"/>
         <w:jc w:val="left"/>
       </w:pPr>
       <w:r>
@@ -2989,14 +2989,14 @@
           <w:rFonts w:ascii="Times New Roman" w:hAnsi="Times New Roman"/>
           <w:b w:val="0"/>
           <w:i w:val="0"/>
-          <w:sz w:val="21"/>
+          <w:sz w:val="20"/>
         </w:rPr>
-        <w:t>Figure 3.5: Core Object-Oriented Component Class Hierarchy ........................................................................ 22</w:t>
+        <w:t>Figure 4.1: AegisPath Enterprise Four-Tier System Architecture ........................................................................ 24</w:t>
       </w:r>
     </w:p>
     <w:p>
       <w:pPr>
-        <w:spacing w:before="0" w:after="60" w:line="360" w:lineRule="auto"/>
+        <w:spacing w:before="0" w:after="40" w:line="360" w:lineRule="auto"/>
         <w:jc w:val="left"/>
       </w:pPr>
       <w:r>
@@ -3004,14 +3004,14 @@
           <w:rFonts w:ascii="Times New Roman" w:hAnsi="Times New Roman"/>
           <w:b w:val="0"/>
           <w:i w:val="0"/>
-          <w:sz w:val="21"/>
+          <w:sz w:val="20"/>
         </w:rPr>
-        <w:t>Figure 4.1: AegisPath Enterprise Four-Tier System Architecture ........................................................................ 24</w:t>
+        <w:t>Figure 4.2: Graph Schema Entity-Relationship and Edge Model ........................................................................ 26</w:t>
       </w:r>
     </w:p>
     <w:p>
       <w:pPr>
-        <w:spacing w:before="0" w:after="60" w:line="360" w:lineRule="auto"/>
+        <w:spacing w:before="0" w:after="40" w:line="360" w:lineRule="auto"/>
         <w:jc w:val="left"/>
       </w:pPr>
       <w:r>
@@ -3019,14 +3019,14 @@
           <w:rFonts w:ascii="Times New Roman" w:hAnsi="Times New Roman"/>
           <w:b w:val="0"/>
           <w:i w:val="0"/>
-          <w:sz w:val="21"/>
+          <w:sz w:val="20"/>
         </w:rPr>
-        <w:t>Figure 4.2: Graph Entity Relationship Diagram (ERD) ........................................................................ 26</w:t>
+        <w:t>Figure 4.3: Multi-Container Docker Microservice Deployment Topology ........................................................................ 28</w:t>
       </w:r>
     </w:p>
     <w:p>
       <w:pPr>
-        <w:spacing w:before="0" w:after="60" w:line="360" w:lineRule="auto"/>
+        <w:spacing w:before="0" w:after="40" w:line="360" w:lineRule="auto"/>
         <w:jc w:val="left"/>
       </w:pPr>
       <w:r>
@@ -3034,14 +3034,14 @@
           <w:rFonts w:ascii="Times New Roman" w:hAnsi="Times New Roman"/>
           <w:b w:val="0"/>
           <w:i w:val="0"/>
-          <w:sz w:val="21"/>
+          <w:sz w:val="20"/>
         </w:rPr>
-        <w:t>Figure 4.3: Docker Multi-Container Deployment Topology ........................................................................ 28</w:t>
+        <w:t>Figure 4.4: Cytoscape.js Blueprint Canvas View with Critical Attack Path Highlight ........................................................................ 30</w:t>
       </w:r>
     </w:p>
     <w:p>
       <w:pPr>
-        <w:spacing w:before="0" w:after="60" w:line="360" w:lineRule="auto"/>
+        <w:spacing w:before="0" w:after="40" w:line="360" w:lineRule="auto"/>
         <w:jc w:val="left"/>
       </w:pPr>
       <w:r>
@@ -3049,14 +3049,14 @@
           <w:rFonts w:ascii="Times New Roman" w:hAnsi="Times New Roman"/>
           <w:b w:val="0"/>
           <w:i w:val="0"/>
-          <w:sz w:val="21"/>
+          <w:sz w:val="20"/>
         </w:rPr>
-        <w:t>Figure 4.4: Screenshot: Multi-Domain Ingestion Hub Modal ........................................................................ 30</w:t>
+        <w:t>Figure 4.5: Multi-Domain Ingestion Hub Modal &amp; Telemetry Monitor ........................................................................ 31</w:t>
       </w:r>
     </w:p>
     <w:p>
       <w:pPr>
-        <w:spacing w:before="0" w:after="60" w:line="360" w:lineRule="auto"/>
+        <w:spacing w:before="0" w:after="40" w:line="360" w:lineRule="auto"/>
         <w:jc w:val="left"/>
       </w:pPr>
       <w:r>
@@ -3064,14 +3064,14 @@
           <w:rFonts w:ascii="Times New Roman" w:hAnsi="Times New Roman"/>
           <w:b w:val="0"/>
           <w:i w:val="0"/>
-          <w:sz w:val="21"/>
+          <w:sz w:val="20"/>
         </w:rPr>
-        <w:t>Figure 4.5: Screenshot: Cytoscape.js Blueprint Canvas &amp; Telemetry HUD ........................................................................ 31</w:t>
+        <w:t>Figure 5.1: Mathematical Formulation of Dynamic Cost-Tensor Calculation ........................................................................ 34</w:t>
       </w:r>
     </w:p>
     <w:p>
       <w:pPr>
-        <w:spacing w:before="0" w:after="60" w:line="360" w:lineRule="auto"/>
+        <w:spacing w:before="0" w:after="40" w:line="360" w:lineRule="auto"/>
         <w:jc w:val="left"/>
       </w:pPr>
       <w:r>
@@ -3079,29 +3079,14 @@
           <w:rFonts w:ascii="Times New Roman" w:hAnsi="Times New Roman"/>
           <w:b w:val="0"/>
           <w:i w:val="0"/>
-          <w:sz w:val="21"/>
+          <w:sz w:val="20"/>
         </w:rPr>
-        <w:t>Figure 4.6: Screenshot: Critical Attack Path Highlight &amp; What-If Remediation ........................................................................ 31</w:t>
+        <w:t>Figure 6.1: Betweenness Centrality &amp; Path Finding Latency vs. Graph Size Benchmark Curve ........................................................................ 41</w:t>
       </w:r>
     </w:p>
     <w:p>
       <w:pPr>
-        <w:spacing w:before="0" w:after="60" w:line="360" w:lineRule="auto"/>
-        <w:jc w:val="left"/>
-      </w:pPr>
-      <w:r>
-        <w:rPr>
-          <w:rFonts w:ascii="Times New Roman" w:hAnsi="Times New Roman"/>
-          <w:b w:val="0"/>
-          <w:i w:val="0"/>
-          <w:sz w:val="21"/>
-        </w:rPr>
-        <w:t>Figure 6.1: Betweenness Centrality Choke Point Severance Benchmark ........................................................................ 41</w:t>
-      </w:r>
-    </w:p>
-    <w:p>
-      <w:pPr>
-        <w:spacing w:before="400" w:after="240" w:line="360" w:lineRule="auto"/>
+        <w:spacing w:before="360" w:after="240" w:line="360" w:lineRule="auto"/>
         <w:jc w:val="center"/>
       </w:pPr>
       <w:r>
@@ -3116,7 +3101,7 @@
     </w:p>
     <w:p>
       <w:pPr>
-        <w:spacing w:before="0" w:after="60" w:line="360" w:lineRule="auto"/>
+        <w:spacing w:before="0" w:after="40" w:line="360" w:lineRule="auto"/>
         <w:jc w:val="left"/>
       </w:pPr>
       <w:r>
@@ -3124,14 +3109,14 @@
           <w:rFonts w:ascii="Times New Roman" w:hAnsi="Times New Roman"/>
           <w:b w:val="0"/>
           <w:i w:val="0"/>
-          <w:sz w:val="21"/>
+          <w:sz w:val="20"/>
         </w:rPr>
         <w:t>Table 2.1: Hardware and System Host Interfaces ........................................................................ 8</w:t>
       </w:r>
     </w:p>
     <w:p>
       <w:pPr>
-        <w:spacing w:before="0" w:after="60" w:line="360" w:lineRule="auto"/>
+        <w:spacing w:before="0" w:after="40" w:line="360" w:lineRule="auto"/>
         <w:jc w:val="left"/>
       </w:pPr>
       <w:r>
@@ -3139,14 +3124,14 @@
           <w:rFonts w:ascii="Times New Roman" w:hAnsi="Times New Roman"/>
           <w:b w:val="0"/>
           <w:i w:val="0"/>
-          <w:sz w:val="21"/>
+          <w:sz w:val="20"/>
         </w:rPr>
         <w:t>Table 2.2: Project Team and Division of Work Responsibilities ........................................................................ 13</w:t>
       </w:r>
     </w:p>
     <w:p>
       <w:pPr>
-        <w:spacing w:before="0" w:after="60" w:line="360" w:lineRule="auto"/>
+        <w:spacing w:before="0" w:after="40" w:line="360" w:lineRule="auto"/>
         <w:jc w:val="left"/>
       </w:pPr>
       <w:r>
@@ -3154,14 +3139,14 @@
           <w:rFonts w:ascii="Times New Roman" w:hAnsi="Times New Roman"/>
           <w:b w:val="0"/>
           <w:i w:val="0"/>
-          <w:sz w:val="21"/>
+          <w:sz w:val="20"/>
         </w:rPr>
         <w:t>Table 2.3: Major Project Development Schedule &amp; Milestones ........................................................................ 13</w:t>
       </w:r>
     </w:p>
     <w:p>
       <w:pPr>
-        <w:spacing w:before="0" w:after="60" w:line="360" w:lineRule="auto"/>
+        <w:spacing w:before="0" w:after="40" w:line="360" w:lineRule="auto"/>
         <w:jc w:val="left"/>
       </w:pPr>
       <w:r>
@@ -3169,14 +3154,14 @@
           <w:rFonts w:ascii="Times New Roman" w:hAnsi="Times New Roman"/>
           <w:b w:val="0"/>
           <w:i w:val="0"/>
-          <w:sz w:val="21"/>
+          <w:sz w:val="20"/>
         </w:rPr>
         <w:t>Table 4.1: Graph Data Dictionary: Node Labels, Properties and Semantics ........................................................................ 26</w:t>
       </w:r>
     </w:p>
     <w:p>
       <w:pPr>
-        <w:spacing w:before="0" w:after="60" w:line="360" w:lineRule="auto"/>
+        <w:spacing w:before="0" w:after="40" w:line="360" w:lineRule="auto"/>
         <w:jc w:val="left"/>
       </w:pPr>
       <w:r>
@@ -3184,14 +3169,14 @@
           <w:rFonts w:ascii="Times New Roman" w:hAnsi="Times New Roman"/>
           <w:b w:val="0"/>
           <w:i w:val="0"/>
-          <w:sz w:val="21"/>
+          <w:sz w:val="20"/>
         </w:rPr>
         <w:t>Table 4.2: Graph Relationship Vectors and Traversability Weights ........................................................................ 27</w:t>
       </w:r>
     </w:p>
     <w:p>
       <w:pPr>
-        <w:spacing w:before="0" w:after="60" w:line="360" w:lineRule="auto"/>
+        <w:spacing w:before="0" w:after="40" w:line="360" w:lineRule="auto"/>
         <w:jc w:val="left"/>
       </w:pPr>
       <w:r>
@@ -3199,14 +3184,14 @@
           <w:rFonts w:ascii="Times New Roman" w:hAnsi="Times New Roman"/>
           <w:b w:val="0"/>
           <w:i w:val="0"/>
-          <w:sz w:val="21"/>
+          <w:sz w:val="20"/>
         </w:rPr>
         <w:t>Table 4.3: Docker Infrastructure Network Port Allocations ........................................................................ 28</w:t>
       </w:r>
     </w:p>
     <w:p>
       <w:pPr>
-        <w:spacing w:before="0" w:after="60" w:line="360" w:lineRule="auto"/>
+        <w:spacing w:before="0" w:after="40" w:line="360" w:lineRule="auto"/>
         <w:jc w:val="left"/>
       </w:pPr>
       <w:r>
@@ -3214,14 +3199,14 @@
           <w:rFonts w:ascii="Times New Roman" w:hAnsi="Times New Roman"/>
           <w:b w:val="0"/>
           <w:i w:val="0"/>
-          <w:sz w:val="21"/>
+          <w:sz w:val="20"/>
         </w:rPr>
         <w:t>Table 5.1: Core Software Packages, Libraries and Runtime Environments ........................................................................ 32</w:t>
       </w:r>
     </w:p>
     <w:p>
       <w:pPr>
-        <w:spacing w:before="0" w:after="60" w:line="360" w:lineRule="auto"/>
+        <w:spacing w:before="0" w:after="40" w:line="360" w:lineRule="auto"/>
         <w:jc w:val="left"/>
       </w:pPr>
       <w:r>
@@ -3229,14 +3214,14 @@
           <w:rFonts w:ascii="Times New Roman" w:hAnsi="Times New Roman"/>
           <w:b w:val="0"/>
           <w:i w:val="0"/>
-          <w:sz w:val="21"/>
+          <w:sz w:val="20"/>
         </w:rPr>
         <w:t>Table 6.1: Comprehensive Test Execution Matrix and Empirical Outcomes ........................................................................ 39</w:t>
       </w:r>
     </w:p>
     <w:p>
       <w:pPr>
-        <w:spacing w:before="400" w:after="240" w:line="360" w:lineRule="auto"/>
+        <w:spacing w:before="360" w:after="200" w:line="360" w:lineRule="auto"/>
         <w:jc w:val="center"/>
       </w:pPr>
       <w:r>
@@ -3251,7 +3236,7 @@
     </w:p>
     <w:p>
       <w:pPr>
-        <w:spacing w:before="0" w:after="240" w:line="312" w:lineRule="auto"/>
+        <w:spacing w:before="0" w:after="200" w:line="312" w:lineRule="auto"/>
         <w:jc w:val="left"/>
       </w:pPr>
       <w:r>
@@ -3259,7 +3244,7 @@
           <w:rFonts w:ascii="Times New Roman" w:hAnsi="Times New Roman"/>
           <w:b w:val="0"/>
           <w:i w:val="0"/>
-          <w:sz w:val="21"/>
+          <w:sz w:val="20"/>
         </w:rPr>
         <w:t>Phase 1: Problem Formulation &amp; Threat Intel API Ingestion (Aug – Sep 2025)</w:t>
         <w:br/>
@@ -3520,6 +3505,62 @@
           <w:sz w:val="24"/>
         </w:rPr>
         <w:t>• Lack of Remediation Impact Quantification: Defenders are forced to guess which vulnerability patch or credential revocation produces the greatest return on investment (ROI). Traditional platforms provide no capability to simulate the topological impact of severing a choke point.</w:t>
+      </w:r>
+    </w:p>
+    <w:p>
+      <w:pPr>
+        <w:keepNext/>
+        <w:spacing w:before="200" w:after="80"/>
+        <w:jc w:val="center"/>
+      </w:pPr>
+      <w:r>
+        <w:drawing>
+          <wp:inline xmlns:a="http://schemas.openxmlformats.org/drawingml/2006/main" xmlns:pic="http://schemas.openxmlformats.org/drawingml/2006/picture">
+            <wp:extent cx="5120640" cy="2469476"/>
+            <wp:docPr id="1" name="Picture 1"/>
+            <wp:cNvGraphicFramePr>
+              <a:graphicFrameLocks noChangeAspect="1"/>
+            </wp:cNvGraphicFramePr>
+            <a:graphic>
+              <a:graphicData uri="http://schemas.openxmlformats.org/drawingml/2006/picture">
+                <pic:pic>
+                  <pic:nvPicPr>
+                    <pic:cNvPr id="0" name="fig_1_1_cvss_vs_attackpath.png"/>
+                    <pic:cNvPicPr/>
+                  </pic:nvPicPr>
+                  <pic:blipFill>
+                    <a:blip r:embed="rId9"/>
+                    <a:stretch>
+                      <a:fillRect/>
+                    </a:stretch>
+                  </pic:blipFill>
+                  <pic:spPr>
+                    <a:xfrm>
+                      <a:off x="0" y="0"/>
+                      <a:ext cx="5120640" cy="2469476"/>
+                    </a:xfrm>
+                    <a:prstGeom prst="rect"/>
+                  </pic:spPr>
+                </pic:pic>
+              </a:graphicData>
+            </a:graphic>
+          </wp:inline>
+        </w:drawing>
+      </w:r>
+    </w:p>
+    <w:p>
+      <w:pPr>
+        <w:spacing w:before="40" w:after="280"/>
+        <w:jc w:val="center"/>
+      </w:pPr>
+      <w:r>
+        <w:rPr>
+          <w:rFonts w:ascii="Times New Roman" w:hAnsi="Times New Roman"/>
+          <w:b/>
+          <w:i/>
+          <w:sz w:val="20"/>
+        </w:rPr>
+        <w:t>Figure 1.1: Enterprise Attack Path Traversal vs. Flat CVSS Severity List</w:t>
       </w:r>
     </w:p>
     <w:p>
@@ -4378,6 +4419,62 @@
     <w:p>
       <w:pPr>
         <w:keepNext/>
+        <w:spacing w:before="200" w:after="80"/>
+        <w:jc w:val="center"/>
+      </w:pPr>
+      <w:r>
+        <w:drawing>
+          <wp:inline xmlns:a="http://schemas.openxmlformats.org/drawingml/2006/main" xmlns:pic="http://schemas.openxmlformats.org/drawingml/2006/picture">
+            <wp:extent cx="5120640" cy="3377868"/>
+            <wp:docPr id="2" name="Picture 2"/>
+            <wp:cNvGraphicFramePr>
+              <a:graphicFrameLocks noChangeAspect="1"/>
+            </wp:cNvGraphicFramePr>
+            <a:graphic>
+              <a:graphicData uri="http://schemas.openxmlformats.org/drawingml/2006/picture">
+                <pic:pic>
+                  <pic:nvPicPr>
+                    <pic:cNvPr id="0" name="fig_3_1_use_case.png"/>
+                    <pic:cNvPicPr/>
+                  </pic:nvPicPr>
+                  <pic:blipFill>
+                    <a:blip r:embed="rId10"/>
+                    <a:stretch>
+                      <a:fillRect/>
+                    </a:stretch>
+                  </pic:blipFill>
+                  <pic:spPr>
+                    <a:xfrm>
+                      <a:off x="0" y="0"/>
+                      <a:ext cx="5120640" cy="3377868"/>
+                    </a:xfrm>
+                    <a:prstGeom prst="rect"/>
+                  </pic:spPr>
+                </pic:pic>
+              </a:graphicData>
+            </a:graphic>
+          </wp:inline>
+        </w:drawing>
+      </w:r>
+    </w:p>
+    <w:p>
+      <w:pPr>
+        <w:spacing w:before="40" w:after="280"/>
+        <w:jc w:val="center"/>
+      </w:pPr>
+      <w:r>
+        <w:rPr>
+          <w:rFonts w:ascii="Times New Roman" w:hAnsi="Times New Roman"/>
+          <w:b/>
+          <w:i/>
+          <w:sz w:val="20"/>
+        </w:rPr>
+        <w:t>Figure 3.1: Comprehensive System Use Case Diagram</w:t>
+      </w:r>
+    </w:p>
+    <w:p>
+      <w:pPr>
+        <w:keepNext/>
         <w:spacing w:before="280" w:after="120"/>
       </w:pPr>
       <w:r>
@@ -4427,6 +4524,62 @@
     <w:p>
       <w:pPr>
         <w:keepNext/>
+        <w:spacing w:before="200" w:after="80"/>
+        <w:jc w:val="center"/>
+      </w:pPr>
+      <w:r>
+        <w:drawing>
+          <wp:inline xmlns:a="http://schemas.openxmlformats.org/drawingml/2006/main" xmlns:pic="http://schemas.openxmlformats.org/drawingml/2006/picture">
+            <wp:extent cx="5120640" cy="3337987"/>
+            <wp:docPr id="3" name="Picture 3"/>
+            <wp:cNvGraphicFramePr>
+              <a:graphicFrameLocks noChangeAspect="1"/>
+            </wp:cNvGraphicFramePr>
+            <a:graphic>
+              <a:graphicData uri="http://schemas.openxmlformats.org/drawingml/2006/picture">
+                <pic:pic>
+                  <pic:nvPicPr>
+                    <pic:cNvPr id="0" name="fig_3_2_sequence.png"/>
+                    <pic:cNvPicPr/>
+                  </pic:nvPicPr>
+                  <pic:blipFill>
+                    <a:blip r:embed="rId11"/>
+                    <a:stretch>
+                      <a:fillRect/>
+                    </a:stretch>
+                  </pic:blipFill>
+                  <pic:spPr>
+                    <a:xfrm>
+                      <a:off x="0" y="0"/>
+                      <a:ext cx="5120640" cy="3337987"/>
+                    </a:xfrm>
+                    <a:prstGeom prst="rect"/>
+                  </pic:spPr>
+                </pic:pic>
+              </a:graphicData>
+            </a:graphic>
+          </wp:inline>
+        </w:drawing>
+      </w:r>
+    </w:p>
+    <w:p>
+      <w:pPr>
+        <w:spacing w:before="40" w:after="280"/>
+        <w:jc w:val="center"/>
+      </w:pPr>
+      <w:r>
+        <w:rPr>
+          <w:rFonts w:ascii="Times New Roman" w:hAnsi="Times New Roman"/>
+          <w:b/>
+          <w:i/>
+          <w:sz w:val="20"/>
+        </w:rPr>
+        <w:t>Figure 3.2: Real-Time Threat Ingestion &amp; Path Recalculation Sequence Diagram</w:t>
+      </w:r>
+    </w:p>
+    <w:p>
+      <w:pPr>
+        <w:keepNext/>
         <w:spacing w:before="280" w:after="120"/>
       </w:pPr>
       <w:r>
@@ -4452,6 +4605,62 @@
           <w:sz w:val="24"/>
         </w:rPr>
         <w:t>The system lifecycle progresses through four states: Baseline Initialization -&gt; Multi-Domain Ingestion -&gt; Graph-Theoretic Pathfinding &amp; Choke Point Discovery -&gt; What-If Remediation &amp; Verification. In the event of real-time EDR alerts, the active graph transitions dynamically into an Incident Recalibration sub-state without requiring system restart.</w:t>
+      </w:r>
+    </w:p>
+    <w:p>
+      <w:pPr>
+        <w:keepNext/>
+        <w:spacing w:before="200" w:after="80"/>
+        <w:jc w:val="center"/>
+      </w:pPr>
+      <w:r>
+        <w:drawing>
+          <wp:inline xmlns:a="http://schemas.openxmlformats.org/drawingml/2006/main" xmlns:pic="http://schemas.openxmlformats.org/drawingml/2006/picture">
+            <wp:extent cx="5120640" cy="4811391"/>
+            <wp:docPr id="4" name="Picture 4"/>
+            <wp:cNvGraphicFramePr>
+              <a:graphicFrameLocks noChangeAspect="1"/>
+            </wp:cNvGraphicFramePr>
+            <a:graphic>
+              <a:graphicData uri="http://schemas.openxmlformats.org/drawingml/2006/picture">
+                <pic:pic>
+                  <pic:nvPicPr>
+                    <pic:cNvPr id="0" name="fig_3_3_activity.png"/>
+                    <pic:cNvPicPr/>
+                  </pic:nvPicPr>
+                  <pic:blipFill>
+                    <a:blip r:embed="rId12"/>
+                    <a:stretch>
+                      <a:fillRect/>
+                    </a:stretch>
+                  </pic:blipFill>
+                  <pic:spPr>
+                    <a:xfrm>
+                      <a:off x="0" y="0"/>
+                      <a:ext cx="5120640" cy="4811391"/>
+                    </a:xfrm>
+                    <a:prstGeom prst="rect"/>
+                  </pic:spPr>
+                </pic:pic>
+              </a:graphicData>
+            </a:graphic>
+          </wp:inline>
+        </w:drawing>
+      </w:r>
+    </w:p>
+    <w:p>
+      <w:pPr>
+        <w:spacing w:before="40" w:after="280"/>
+        <w:jc w:val="center"/>
+      </w:pPr>
+      <w:r>
+        <w:rPr>
+          <w:rFonts w:ascii="Times New Roman" w:hAnsi="Times New Roman"/>
+          <w:b/>
+          <w:i/>
+          <w:sz w:val="20"/>
+        </w:rPr>
+        <w:t>Figure 3.3: Attack Path Calculation &amp; Min-Cut Remediation Flow Activity Diagram</w:t>
       </w:r>
     </w:p>
     <w:p>
@@ -4495,6 +4704,62 @@
       </w:r>
     </w:p>
     <w:p>
+      <w:pPr>
+        <w:keepNext/>
+        <w:spacing w:before="200" w:after="80"/>
+        <w:jc w:val="center"/>
+      </w:pPr>
+      <w:r>
+        <w:drawing>
+          <wp:inline xmlns:a="http://schemas.openxmlformats.org/drawingml/2006/main" xmlns:pic="http://schemas.openxmlformats.org/drawingml/2006/picture">
+            <wp:extent cx="5120640" cy="3337987"/>
+            <wp:docPr id="5" name="Picture 5"/>
+            <wp:cNvGraphicFramePr>
+              <a:graphicFrameLocks noChangeAspect="1"/>
+            </wp:cNvGraphicFramePr>
+            <a:graphic>
+              <a:graphicData uri="http://schemas.openxmlformats.org/drawingml/2006/picture">
+                <pic:pic>
+                  <pic:nvPicPr>
+                    <pic:cNvPr id="0" name="fig_3_4_class_diagram.png"/>
+                    <pic:cNvPicPr/>
+                  </pic:nvPicPr>
+                  <pic:blipFill>
+                    <a:blip r:embed="rId13"/>
+                    <a:stretch>
+                      <a:fillRect/>
+                    </a:stretch>
+                  </pic:blipFill>
+                  <pic:spPr>
+                    <a:xfrm>
+                      <a:off x="0" y="0"/>
+                      <a:ext cx="5120640" cy="3337987"/>
+                    </a:xfrm>
+                    <a:prstGeom prst="rect"/>
+                  </pic:spPr>
+                </pic:pic>
+              </a:graphicData>
+            </a:graphic>
+          </wp:inline>
+        </w:drawing>
+      </w:r>
+    </w:p>
+    <w:p>
+      <w:pPr>
+        <w:spacing w:before="40" w:after="280"/>
+        <w:jc w:val="center"/>
+      </w:pPr>
+      <w:r>
+        <w:rPr>
+          <w:rFonts w:ascii="Times New Roman" w:hAnsi="Times New Roman"/>
+          <w:b/>
+          <w:i/>
+          <w:sz w:val="20"/>
+        </w:rPr>
+        <w:t>Figure 3.4: Core Object-Oriented Component Class Hierarchy &amp; Object Model</w:t>
+      </w:r>
+    </w:p>
+    <w:p>
       <w:r>
         <w:br w:type="page"/>
       </w:r>
@@ -4571,6 +4836,62 @@
     <w:p>
       <w:pPr>
         <w:keepNext/>
+        <w:spacing w:before="200" w:after="80"/>
+        <w:jc w:val="center"/>
+      </w:pPr>
+      <w:r>
+        <w:drawing>
+          <wp:inline xmlns:a="http://schemas.openxmlformats.org/drawingml/2006/main" xmlns:pic="http://schemas.openxmlformats.org/drawingml/2006/picture">
+            <wp:extent cx="5120640" cy="3337987"/>
+            <wp:docPr id="6" name="Picture 6"/>
+            <wp:cNvGraphicFramePr>
+              <a:graphicFrameLocks noChangeAspect="1"/>
+            </wp:cNvGraphicFramePr>
+            <a:graphic>
+              <a:graphicData uri="http://schemas.openxmlformats.org/drawingml/2006/picture">
+                <pic:pic>
+                  <pic:nvPicPr>
+                    <pic:cNvPr id="0" name="fig_4_1_architecture.png"/>
+                    <pic:cNvPicPr/>
+                  </pic:nvPicPr>
+                  <pic:blipFill>
+                    <a:blip r:embed="rId14"/>
+                    <a:stretch>
+                      <a:fillRect/>
+                    </a:stretch>
+                  </pic:blipFill>
+                  <pic:spPr>
+                    <a:xfrm>
+                      <a:off x="0" y="0"/>
+                      <a:ext cx="5120640" cy="3337987"/>
+                    </a:xfrm>
+                    <a:prstGeom prst="rect"/>
+                  </pic:spPr>
+                </pic:pic>
+              </a:graphicData>
+            </a:graphic>
+          </wp:inline>
+        </w:drawing>
+      </w:r>
+    </w:p>
+    <w:p>
+      <w:pPr>
+        <w:spacing w:before="40" w:after="280"/>
+        <w:jc w:val="center"/>
+      </w:pPr>
+      <w:r>
+        <w:rPr>
+          <w:rFonts w:ascii="Times New Roman" w:hAnsi="Times New Roman"/>
+          <w:b/>
+          <w:i/>
+          <w:sz w:val="20"/>
+        </w:rPr>
+        <w:t>Figure 4.1: AegisPath Enterprise Four-Tier System Architecture</w:t>
+      </w:r>
+    </w:p>
+    <w:p>
+      <w:pPr>
+        <w:keepNext/>
         <w:spacing w:before="280" w:after="120"/>
       </w:pPr>
       <w:r>
@@ -4615,6 +4936,62 @@
         <w:t>• Relationship Vectors: EXPOSES, PROTECTED_BY, ASSUMES_ROLE, HAS_VULNERABILITY, MEMBER_OF, GENERIC_ALL, WRITE_DACL, ADMIN_TO, HAS_SESSION, DCSYNC.</w:t>
         <w:br/>
         <w:t>• Normalization: All AWS entity identifiers use native ARNs or instance IDs; all Active Directory entities use unique Security Identifiers (SIDs). Graph edge properties store weight, traversability, and active alert flags.</w:t>
+      </w:r>
+    </w:p>
+    <w:p>
+      <w:pPr>
+        <w:keepNext/>
+        <w:spacing w:before="200" w:after="80"/>
+        <w:jc w:val="center"/>
+      </w:pPr>
+      <w:r>
+        <w:drawing>
+          <wp:inline xmlns:a="http://schemas.openxmlformats.org/drawingml/2006/main" xmlns:pic="http://schemas.openxmlformats.org/drawingml/2006/picture">
+            <wp:extent cx="5120640" cy="3337987"/>
+            <wp:docPr id="7" name="Picture 7"/>
+            <wp:cNvGraphicFramePr>
+              <a:graphicFrameLocks noChangeAspect="1"/>
+            </wp:cNvGraphicFramePr>
+            <a:graphic>
+              <a:graphicData uri="http://schemas.openxmlformats.org/drawingml/2006/picture">
+                <pic:pic>
+                  <pic:nvPicPr>
+                    <pic:cNvPr id="0" name="fig_4_2_schema.png"/>
+                    <pic:cNvPicPr/>
+                  </pic:nvPicPr>
+                  <pic:blipFill>
+                    <a:blip r:embed="rId15"/>
+                    <a:stretch>
+                      <a:fillRect/>
+                    </a:stretch>
+                  </pic:blipFill>
+                  <pic:spPr>
+                    <a:xfrm>
+                      <a:off x="0" y="0"/>
+                      <a:ext cx="5120640" cy="3337987"/>
+                    </a:xfrm>
+                    <a:prstGeom prst="rect"/>
+                  </pic:spPr>
+                </pic:pic>
+              </a:graphicData>
+            </a:graphic>
+          </wp:inline>
+        </w:drawing>
+      </w:r>
+    </w:p>
+    <w:p>
+      <w:pPr>
+        <w:spacing w:before="40" w:after="280"/>
+        <w:jc w:val="center"/>
+      </w:pPr>
+      <w:r>
+        <w:rPr>
+          <w:rFonts w:ascii="Times New Roman" w:hAnsi="Times New Roman"/>
+          <w:b/>
+          <w:i/>
+          <w:sz w:val="20"/>
+        </w:rPr>
+        <w:t>Figure 4.2: Graph Schema Entity-Relationship and Edge Model</w:t>
       </w:r>
     </w:p>
     <w:p>
@@ -4660,6 +5037,62 @@
     <w:p>
       <w:pPr>
         <w:keepNext/>
+        <w:spacing w:before="200" w:after="80"/>
+        <w:jc w:val="center"/>
+      </w:pPr>
+      <w:r>
+        <w:drawing>
+          <wp:inline xmlns:a="http://schemas.openxmlformats.org/drawingml/2006/main" xmlns:pic="http://schemas.openxmlformats.org/drawingml/2006/picture">
+            <wp:extent cx="5120640" cy="3337987"/>
+            <wp:docPr id="8" name="Picture 8"/>
+            <wp:cNvGraphicFramePr>
+              <a:graphicFrameLocks noChangeAspect="1"/>
+            </wp:cNvGraphicFramePr>
+            <a:graphic>
+              <a:graphicData uri="http://schemas.openxmlformats.org/drawingml/2006/picture">
+                <pic:pic>
+                  <pic:nvPicPr>
+                    <pic:cNvPr id="0" name="fig_4_3_deployment.png"/>
+                    <pic:cNvPicPr/>
+                  </pic:nvPicPr>
+                  <pic:blipFill>
+                    <a:blip r:embed="rId16"/>
+                    <a:stretch>
+                      <a:fillRect/>
+                    </a:stretch>
+                  </pic:blipFill>
+                  <pic:spPr>
+                    <a:xfrm>
+                      <a:off x="0" y="0"/>
+                      <a:ext cx="5120640" cy="3337987"/>
+                    </a:xfrm>
+                    <a:prstGeom prst="rect"/>
+                  </pic:spPr>
+                </pic:pic>
+              </a:graphicData>
+            </a:graphic>
+          </wp:inline>
+        </w:drawing>
+      </w:r>
+    </w:p>
+    <w:p>
+      <w:pPr>
+        <w:spacing w:before="40" w:after="280"/>
+        <w:jc w:val="center"/>
+      </w:pPr>
+      <w:r>
+        <w:rPr>
+          <w:rFonts w:ascii="Times New Roman" w:hAnsi="Times New Roman"/>
+          <w:b/>
+          <w:i/>
+          <w:sz w:val="20"/>
+        </w:rPr>
+        <w:t>Figure 4.3: Multi-Container Docker Microservice Deployment Topology</w:t>
+      </w:r>
+    </w:p>
+    <w:p>
+      <w:pPr>
+        <w:keepNext/>
         <w:spacing w:before="280" w:after="120"/>
       </w:pPr>
       <w:r>
@@ -4698,6 +5131,118 @@
       </w:r>
     </w:p>
     <w:p>
+      <w:pPr>
+        <w:keepNext/>
+        <w:spacing w:before="200" w:after="80"/>
+        <w:jc w:val="center"/>
+      </w:pPr>
+      <w:r>
+        <w:drawing>
+          <wp:inline xmlns:a="http://schemas.openxmlformats.org/drawingml/2006/main" xmlns:pic="http://schemas.openxmlformats.org/drawingml/2006/picture">
+            <wp:extent cx="5120640" cy="2245614"/>
+            <wp:docPr id="9" name="Picture 9"/>
+            <wp:cNvGraphicFramePr>
+              <a:graphicFrameLocks noChangeAspect="1"/>
+            </wp:cNvGraphicFramePr>
+            <a:graphic>
+              <a:graphicData uri="http://schemas.openxmlformats.org/drawingml/2006/picture">
+                <pic:pic>
+                  <pic:nvPicPr>
+                    <pic:cNvPr id="0" name="fig_4_4_canvas.png"/>
+                    <pic:cNvPicPr/>
+                  </pic:nvPicPr>
+                  <pic:blipFill>
+                    <a:blip r:embed="rId17"/>
+                    <a:stretch>
+                      <a:fillRect/>
+                    </a:stretch>
+                  </pic:blipFill>
+                  <pic:spPr>
+                    <a:xfrm>
+                      <a:off x="0" y="0"/>
+                      <a:ext cx="5120640" cy="2245614"/>
+                    </a:xfrm>
+                    <a:prstGeom prst="rect"/>
+                  </pic:spPr>
+                </pic:pic>
+              </a:graphicData>
+            </a:graphic>
+          </wp:inline>
+        </w:drawing>
+      </w:r>
+    </w:p>
+    <w:p>
+      <w:pPr>
+        <w:spacing w:before="40" w:after="280"/>
+        <w:jc w:val="center"/>
+      </w:pPr>
+      <w:r>
+        <w:rPr>
+          <w:rFonts w:ascii="Times New Roman" w:hAnsi="Times New Roman"/>
+          <w:b/>
+          <w:i/>
+          <w:sz w:val="20"/>
+        </w:rPr>
+        <w:t>Figure 4.4: Cytoscape.js Blueprint Canvas View with Critical Attack Path Highlight</w:t>
+      </w:r>
+    </w:p>
+    <w:p>
+      <w:pPr>
+        <w:keepNext/>
+        <w:spacing w:before="200" w:after="80"/>
+        <w:jc w:val="center"/>
+      </w:pPr>
+      <w:r>
+        <w:drawing>
+          <wp:inline xmlns:a="http://schemas.openxmlformats.org/drawingml/2006/main" xmlns:pic="http://schemas.openxmlformats.org/drawingml/2006/picture">
+            <wp:extent cx="5120640" cy="2245614"/>
+            <wp:docPr id="10" name="Picture 10"/>
+            <wp:cNvGraphicFramePr>
+              <a:graphicFrameLocks noChangeAspect="1"/>
+            </wp:cNvGraphicFramePr>
+            <a:graphic>
+              <a:graphicData uri="http://schemas.openxmlformats.org/drawingml/2006/picture">
+                <pic:pic>
+                  <pic:nvPicPr>
+                    <pic:cNvPr id="0" name="fig_4_5_telemetry.png"/>
+                    <pic:cNvPicPr/>
+                  </pic:nvPicPr>
+                  <pic:blipFill>
+                    <a:blip r:embed="rId18"/>
+                    <a:stretch>
+                      <a:fillRect/>
+                    </a:stretch>
+                  </pic:blipFill>
+                  <pic:spPr>
+                    <a:xfrm>
+                      <a:off x="0" y="0"/>
+                      <a:ext cx="5120640" cy="2245614"/>
+                    </a:xfrm>
+                    <a:prstGeom prst="rect"/>
+                  </pic:spPr>
+                </pic:pic>
+              </a:graphicData>
+            </a:graphic>
+          </wp:inline>
+        </w:drawing>
+      </w:r>
+    </w:p>
+    <w:p>
+      <w:pPr>
+        <w:spacing w:before="40" w:after="280"/>
+        <w:jc w:val="center"/>
+      </w:pPr>
+      <w:r>
+        <w:rPr>
+          <w:rFonts w:ascii="Times New Roman" w:hAnsi="Times New Roman"/>
+          <w:b/>
+          <w:i/>
+          <w:sz w:val="20"/>
+        </w:rPr>
+        <w:t>Figure 4.5: Multi-Domain Ingestion Hub Modal &amp; Telemetry Monitor</w:t>
+      </w:r>
+    </w:p>
+    <w:p>
       <w:r>
         <w:br w:type="page"/>
       </w:r>
@@ -4792,6 +5337,62 @@
         <w:t>• Decoupled Async Persistence: By piping compiled Cypher batches to mgconsole inside a daemon thread, database writes never impede HTTP API responsiveness.</w:t>
         <w:br/>
         <w:t>• Hardware-Accelerated Rendering: Cytoscape.js caches canvas layers to an offscreen GPU texture buffer during pan and zoom gestures, eliminating DOM lag.</w:t>
+      </w:r>
+    </w:p>
+    <w:p>
+      <w:pPr>
+        <w:keepNext/>
+        <w:spacing w:before="200" w:after="80"/>
+        <w:jc w:val="center"/>
+      </w:pPr>
+      <w:r>
+        <w:drawing>
+          <wp:inline xmlns:a="http://schemas.openxmlformats.org/drawingml/2006/main" xmlns:pic="http://schemas.openxmlformats.org/drawingml/2006/picture">
+            <wp:extent cx="5120640" cy="2955136"/>
+            <wp:docPr id="11" name="Picture 11"/>
+            <wp:cNvGraphicFramePr>
+              <a:graphicFrameLocks noChangeAspect="1"/>
+            </wp:cNvGraphicFramePr>
+            <a:graphic>
+              <a:graphicData uri="http://schemas.openxmlformats.org/drawingml/2006/picture">
+                <pic:pic>
+                  <pic:nvPicPr>
+                    <pic:cNvPr id="0" name="fig_5_1_cost_tensor.png"/>
+                    <pic:cNvPicPr/>
+                  </pic:nvPicPr>
+                  <pic:blipFill>
+                    <a:blip r:embed="rId19"/>
+                    <a:stretch>
+                      <a:fillRect/>
+                    </a:stretch>
+                  </pic:blipFill>
+                  <pic:spPr>
+                    <a:xfrm>
+                      <a:off x="0" y="0"/>
+                      <a:ext cx="5120640" cy="2955136"/>
+                    </a:xfrm>
+                    <a:prstGeom prst="rect"/>
+                  </pic:spPr>
+                </pic:pic>
+              </a:graphicData>
+            </a:graphic>
+          </wp:inline>
+        </w:drawing>
+      </w:r>
+    </w:p>
+    <w:p>
+      <w:pPr>
+        <w:spacing w:before="40" w:after="280"/>
+        <w:jc w:val="center"/>
+      </w:pPr>
+      <w:r>
+        <w:rPr>
+          <w:rFonts w:ascii="Times New Roman" w:hAnsi="Times New Roman"/>
+          <w:b/>
+          <w:i/>
+          <w:sz w:val="20"/>
+        </w:rPr>
+        <w:t>Figure 5.1: Mathematical Formulation of Dynamic Cost-Tensor Calculation</w:t>
       </w:r>
     </w:p>
     <w:p>
@@ -5002,6 +5603,62 @@
         <w:t>• Test Case TC-04: Betweenness Centrality Choke Point Isolation. Result: PASS. Isolated cut-vertex server DF-MS-SHS.PHANTOM.CORP as the primary topological bottleneck.</w:t>
         <w:br/>
         <w:t>• Test Case TC-05: What-If Remediation Simulation. Result: PASS. Simulated severance of DF-MS-SHS eliminated 8 viable breach chains, achieving a verified 19.0% reduction in total enterprise attack surface exposure.</w:t>
+      </w:r>
+    </w:p>
+    <w:p>
+      <w:pPr>
+        <w:keepNext/>
+        <w:spacing w:before="200" w:after="80"/>
+        <w:jc w:val="center"/>
+      </w:pPr>
+      <w:r>
+        <w:drawing>
+          <wp:inline xmlns:a="http://schemas.openxmlformats.org/drawingml/2006/main" xmlns:pic="http://schemas.openxmlformats.org/drawingml/2006/picture">
+            <wp:extent cx="5120640" cy="3093257"/>
+            <wp:docPr id="12" name="Picture 12"/>
+            <wp:cNvGraphicFramePr>
+              <a:graphicFrameLocks noChangeAspect="1"/>
+            </wp:cNvGraphicFramePr>
+            <a:graphic>
+              <a:graphicData uri="http://schemas.openxmlformats.org/drawingml/2006/picture">
+                <pic:pic>
+                  <pic:nvPicPr>
+                    <pic:cNvPr id="0" name="fig_6_1_benchmark.png"/>
+                    <pic:cNvPicPr/>
+                  </pic:nvPicPr>
+                  <pic:blipFill>
+                    <a:blip r:embed="rId20"/>
+                    <a:stretch>
+                      <a:fillRect/>
+                    </a:stretch>
+                  </pic:blipFill>
+                  <pic:spPr>
+                    <a:xfrm>
+                      <a:off x="0" y="0"/>
+                      <a:ext cx="5120640" cy="3093257"/>
+                    </a:xfrm>
+                    <a:prstGeom prst="rect"/>
+                  </pic:spPr>
+                </pic:pic>
+              </a:graphicData>
+            </a:graphic>
+          </wp:inline>
+        </w:drawing>
+      </w:r>
+    </w:p>
+    <w:p>
+      <w:pPr>
+        <w:spacing w:before="40" w:after="280"/>
+        <w:jc w:val="center"/>
+      </w:pPr>
+      <w:r>
+        <w:rPr>
+          <w:rFonts w:ascii="Times New Roman" w:hAnsi="Times New Roman"/>
+          <w:b/>
+          <w:i/>
+          <w:sz w:val="20"/>
+        </w:rPr>
+        <w:t>Figure 6.1: Betweenness Centrality &amp; Path Finding Latency vs. Graph Size Benchmark Curve</w:t>
       </w:r>
     </w:p>
     <w:p>

</xml_diff>